<commit_message>
docs: replace SmartRail_Report_2 with the version containing the stage 3 user guide
The previous commit (7275be4) captured a locally edited copy by mistake;
this is the intended version, with Appendix E documenting the platform
screen (/platform) and phone app (/app) on port 8766.

Co-Authored-By: Claude Opus 5.5 <noreply@anthropic.com>
</commit_message>
<xml_diff>
--- a/Documentation/SmartRail_Report_2.docx
+++ b/Documentation/SmartRail_Report_2.docx
@@ -88,10 +88,15 @@
           <w:color w:val="475569"/>
           <w:sz w:val="19"/>
           <w:szCs w:val="19"/>
-          <w:lang w:val="en-GB"/>
-        </w:rPr>
-        <w:t>0</w:t>
-      </w:r>
+        </w:rPr>
+        <w:t>236333 Project in Internet of Things · Interdisciplinary Center for Smart Technologies (ICST)</w:t>
+      </w:r>
+    </w:p>
+    <w:p>
+      <w:pPr>
+        <w:spacing w:after="240" w:line="264" w:lineRule="auto"/>
+        <w:jc w:val="center"/>
+      </w:pPr>
       <w:r>
         <w:rPr>
           <w:rFonts w:ascii="Calibri" w:eastAsia="Calibri" w:hAnsi="Calibri" w:cs="Calibri"/>
@@ -99,59 +104,6 @@
           <w:sz w:val="19"/>
           <w:szCs w:val="19"/>
         </w:rPr>
-        <w:t>236</w:t>
-      </w:r>
-      <w:r>
-        <w:rPr>
-          <w:rFonts w:ascii="Calibri" w:eastAsia="Calibri" w:hAnsi="Calibri" w:cs="Calibri"/>
-          <w:color w:val="475569"/>
-          <w:sz w:val="19"/>
-          <w:szCs w:val="19"/>
-          <w:lang w:val="en-GB"/>
-        </w:rPr>
-        <w:t>0</w:t>
-      </w:r>
-      <w:r>
-        <w:rPr>
-          <w:rFonts w:ascii="Calibri" w:eastAsia="Calibri" w:hAnsi="Calibri" w:cs="Calibri"/>
-          <w:color w:val="475569"/>
-          <w:sz w:val="19"/>
-          <w:szCs w:val="19"/>
-        </w:rPr>
-        <w:t>333</w:t>
-      </w:r>
-      <w:r>
-        <w:rPr>
-          <w:rFonts w:ascii="Calibri" w:eastAsia="Calibri" w:hAnsi="Calibri" w:cs="Calibri"/>
-          <w:color w:val="475569"/>
-          <w:sz w:val="19"/>
-          <w:szCs w:val="19"/>
-          <w:lang w:val="en-GB"/>
-        </w:rPr>
-        <w:t xml:space="preserve"> + 02360332</w:t>
-      </w:r>
-      <w:r>
-        <w:rPr>
-          <w:rFonts w:ascii="Calibri" w:eastAsia="Calibri" w:hAnsi="Calibri" w:cs="Calibri"/>
-          <w:color w:val="475569"/>
-          <w:sz w:val="19"/>
-          <w:szCs w:val="19"/>
-        </w:rPr>
-        <w:t xml:space="preserve"> Project in Internet of Things · Interdisciplinary Center for Smart Technologies (ICST)</w:t>
-      </w:r>
-    </w:p>
-    <w:p>
-      <w:pPr>
-        <w:spacing w:after="240" w:line="264" w:lineRule="auto"/>
-        <w:jc w:val="center"/>
-      </w:pPr>
-      <w:r>
-        <w:rPr>
-          <w:rFonts w:ascii="Calibri" w:eastAsia="Calibri" w:hAnsi="Calibri" w:cs="Calibri"/>
-          <w:color w:val="475569"/>
-          <w:sz w:val="19"/>
-          <w:szCs w:val="19"/>
-        </w:rPr>
         <w:t>Taub Faculty of Computer Science, Technion · October 2026</w:t>
       </w:r>
     </w:p>
@@ -282,14 +234,6 @@
           <w:szCs w:val="21"/>
         </w:rPr>
         <w:t xml:space="preserve">SmartRail closes the loop at seat level rather than at door or vehicle level. Seat-level sensing on the train feeds two passenger-facing interfaces, and a simulation estimates what they are worth in seconds of dwell time. The interfaces are deliberately shaped differently because they are read by different numbers of </w:t>
-      </w:r>
-      <w:r>
-        <w:rPr>
-          <w:rFonts w:ascii="Calibri" w:eastAsia="Calibri" w:hAnsi="Calibri" w:cs="Calibri"/>
-          <w:color w:val="0F172A"/>
-          <w:sz w:val="21"/>
-          <w:szCs w:val="21"/>
-        </w:rPr>
         <w:lastRenderedPageBreak/>
         <w:t>people at once: the platform screen is read by everybody waiting at the same moment, so it carries only positional facts and names no carriage, while the phone application is read by one passenger and may give one instruction precisely because it remembers what it told the previous passenger. Section 5 shows why that asymmetry is the whole design.</w:t>
       </w:r>
@@ -494,6 +438,8 @@
       <w:pPr>
         <w:pStyle w:val="Heading2"/>
         <w:spacing w:before="200" w:after="100"/>
+      </w:pPr>
+      <w:r>
         <w:rPr>
           <w:rFonts w:ascii="Calibri" w:eastAsia="Calibri" w:hAnsi="Calibri" w:cs="Calibri"/>
           <w:b/>
@@ -501,17 +447,6 @@
           <w:color w:val="0F172A"/>
           <w:sz w:val="23"/>
           <w:szCs w:val="23"/>
-          <w:lang w:val="en-GB"/>
-        </w:rPr>
-      </w:pPr>
-      <w:r>
-        <w:rPr>
-          <w:rFonts w:ascii="Calibri" w:eastAsia="Calibri" w:hAnsi="Calibri" w:cs="Calibri"/>
-          <w:b/>
-          <w:bCs/>
-          <w:color w:val="0F172A"/>
-          <w:sz w:val="23"/>
-          <w:szCs w:val="23"/>
         </w:rPr>
         <w:lastRenderedPageBreak/>
         <w:t>The sensor</w:t>
@@ -520,13 +455,20 @@
     <w:p>
       <w:pPr>
         <w:spacing w:after="110" w:line="264" w:lineRule="auto"/>
+      </w:pPr>
+      <w:r>
         <w:rPr>
           <w:rFonts w:ascii="Calibri" w:eastAsia="Calibri" w:hAnsi="Calibri" w:cs="Calibri"/>
           <w:color w:val="0F172A"/>
           <w:sz w:val="21"/>
           <w:szCs w:val="21"/>
-          <w:lang w:val="en-GB"/>
-        </w:rPr>
+        </w:rPr>
+        <w:t>Each seat is sensed with a Sharp GP2Y0A21YK0F infrared distance sensor [1]. It emits an infrared pulse and measures the angle at which the reflection returns, so it measures distance by triangulation rather than by reflected intensity. That matters here: the reading barely changes between a light and a dark surface above roughly 20 cm, so clothing colour has little effect, which is the weakness that disqualifies a simple reflective sensor for this job.</w:t>
+      </w:r>
+    </w:p>
+    <w:p>
+      <w:pPr>
+        <w:spacing w:after="110" w:line="264" w:lineRule="auto"/>
       </w:pPr>
       <w:r>
         <w:rPr>
@@ -535,71 +477,7 @@
           <w:sz w:val="21"/>
           <w:szCs w:val="21"/>
         </w:rPr>
-        <w:t xml:space="preserve">Each seat uses a Sharp GP2Y0A21YK0F infrared distance sensor [1] that measures distance via triangulation, ensuring clothing color does not affect readings. Because its output is non-linear, the firmware converts voltage to distance using </w:t>
-      </w:r>
-      <m:oMath>
-        <m:r>
-          <w:rPr>
-            <w:rFonts w:ascii="Cambria Math" w:eastAsia="Calibri" w:hAnsi="Cambria Math" w:cs="Calibri"/>
-            <w:color w:val="0F172A"/>
-            <w:sz w:val="21"/>
-            <w:szCs w:val="21"/>
-          </w:rPr>
-          <m:t>d=29.988⋅</m:t>
-        </m:r>
-        <m:sSup>
-          <m:sSupPr>
-            <m:ctrlPr>
-              <w:rPr>
-                <w:rFonts w:ascii="Cambria Math" w:eastAsia="Calibri" w:hAnsi="Cambria Math" w:cs="Calibri"/>
-                <w:color w:val="0F172A"/>
-                <w:sz w:val="21"/>
-                <w:szCs w:val="21"/>
-              </w:rPr>
-            </m:ctrlPr>
-          </m:sSupPr>
-          <m:e>
-            <m:r>
-              <w:rPr>
-                <w:rFonts w:ascii="Cambria Math" w:eastAsia="Calibri" w:hAnsi="Cambria Math" w:cs="Calibri"/>
-                <w:color w:val="0F172A"/>
-                <w:sz w:val="21"/>
-                <w:szCs w:val="21"/>
-              </w:rPr>
-              <m:t>V</m:t>
-            </m:r>
-          </m:e>
-          <m:sup>
-            <m:r>
-              <w:rPr>
-                <w:rFonts w:ascii="Cambria Math" w:eastAsia="Calibri" w:hAnsi="Cambria Math" w:cs="Calibri"/>
-                <w:color w:val="0F172A"/>
-                <w:sz w:val="21"/>
-                <w:szCs w:val="21"/>
-              </w:rPr>
-              <m:t>-1.173</m:t>
-            </m:r>
-          </m:sup>
-        </m:sSup>
-      </m:oMath>
-      <w:r>
-        <w:rPr>
-          <w:rFonts w:ascii="Calibri" w:eastAsia="Calibri" w:hAnsi="Calibri" w:cs="Calibri"/>
-          <w:color w:val="0F172A"/>
-          <w:sz w:val="21"/>
-          <w:szCs w:val="21"/>
-        </w:rPr>
-        <w:t xml:space="preserve"> cm [1]. The sensor's limitations dictate its hardware setup: a bypass capacitor is required to handle voltage sag from emitter bursts [1], and its non-monotonic behavior below 8 cm requires a minimum 15 cm clearance. Finally, to stay within its 10 to 80 cm usable range, the sensor is mounted above the seat and aimed forward at the passenger's lap rather than down at the head</w:t>
-      </w:r>
-      <w:r>
-        <w:rPr>
-          <w:rFonts w:ascii="Calibri" w:eastAsia="Calibri" w:hAnsi="Calibri" w:cs="Calibri"/>
-          <w:color w:val="0F172A"/>
-          <w:sz w:val="21"/>
-          <w:szCs w:val="21"/>
-          <w:lang w:val="en-GB"/>
-        </w:rPr>
-        <w:t>.</w:t>
+        <w:t>Three properties of the device shaped the design. Its output is not linear, so the firmware converts voltage to distance with the datasheet fit d = 29.988 · V^−1.173 centimetres [1]. It is non-monotonic below about 8 cm, where an object pressed close returns the same voltage as one far away, so the mounting must keep every real reading above roughly 15 cm. Its emitter fires in bursts, which makes the supply sag through breadboard wiring, and the datasheet asks for a bypass capacitor next to the sensor for that reason [1]. The usable range is 10 to 80 cm while a seated person measures about 85 to 90 cm from cushion to head, so the sensor is mounted above the seat and aimed forward at the lap rather than down at the head, putting both the empty and the occupied reading inside the usable range.</w:t>
       </w:r>
     </w:p>
     <w:p>
@@ -1226,6 +1104,7 @@
           <w:sz w:val="23"/>
           <w:szCs w:val="23"/>
         </w:rPr>
+        <w:lastRenderedPageBreak/>
         <w:t>Communication</w:t>
       </w:r>
     </w:p>
@@ -1260,7 +1139,6 @@
           <w:sz w:val="23"/>
           <w:szCs w:val="23"/>
         </w:rPr>
-        <w:lastRenderedPageBreak/>
         <w:t>The two passenger interfaces</w:t>
       </w:r>
     </w:p>
@@ -1417,7 +1295,9 @@
           <w:sz w:val="21"/>
           <w:szCs w:val="21"/>
         </w:rPr>
-        <w:t>Sensing a free seat is the easy half of this project. The half that carries the claim is whether telling passengers about it shortens boarding, and the prototype cannot answer that, so it is answered by simulation. Passengers arrive at a station as a Poisson process and each chooses a carriage independently; because the choices are independent, the thinning property makes the number boarding each carriage Poisson as well, with a mean equal to the arrival rate times that carriage's share [5]. The model never draws a per-carriage Poisson variable directly, so this is a property that emerges rather than one built in. Dwell follows the standard formulation [6][7]: a fixed term, a term per alighting passenger and a term per boarding passenger with a crowding penalty, taken at the busiest door rather than averaged. The generic experiments use one twelve-carriage train of 108 seats a carriage over 500 simulated stops.</w:t>
+        <w:t xml:space="preserve">Sensing a free seat is the easy half of this project. The half that carries the claim is whether telling passengers about it shortens boarding, and the prototype cannot answer that, so it is answered by simulation. Passengers arrive at a station as a Poisson process and each chooses a carriage independently; because the </w:t>
+        <w:lastRenderedPageBreak/>
+        <w:t>choices are independent, the thinning property makes the number boarding each carriage Poisson as well, with a mean equal to the arrival rate times that carriage's share [5]. The model never draws a per-carriage Poisson variable directly, so this is a property that emerges rather than one built in. Dwell follows the standard formulation [6][7]: a fixed term, a term per alighting passenger and a term per boarding passenger with a crowding penalty, taken at the busiest door rather than averaged. The generic experiments use one twelve-carriage train of 108 seats a carriage over 500 simulated stops.</w:t>
       </w:r>
     </w:p>
     <w:p>
@@ -1433,7 +1313,6 @@
           <w:sz w:val="21"/>
           <w:szCs w:val="21"/>
         </w:rPr>
-        <w:lastRenderedPageBreak/>
         <w:t xml:space="preserve">What guidance changes is not the shape of the distribution but its means. </w:t>
       </w:r>
       <w:r>
@@ -2159,8 +2038,8 @@
         </w:rPr>
         <w:lastRenderedPageBreak/>
         <w:drawing>
-          <wp:inline distT="0" distB="0" distL="0" distR="0" wp14:anchorId="19286852" wp14:editId="1599C458">
-            <wp:extent cx="3372401" cy="1772193"/>
+          <wp:inline distT="0" distB="0" distL="0" distR="0" wp14:anchorId="19286852" wp14:editId="3E36E2F0">
+            <wp:extent cx="4295775" cy="2257425"/>
             <wp:effectExtent l="0" t="0" r="0" b="0"/>
             <wp:docPr id="3" name="Picture 3"/>
             <wp:cNvGraphicFramePr>
@@ -2185,7 +2064,7 @@
                   <pic:spPr bwMode="auto">
                     <a:xfrm>
                       <a:off x="0" y="0"/>
-                      <a:ext cx="3385680" cy="1779171"/>
+                      <a:ext cx="4295775" cy="2257425"/>
                     </a:xfrm>
                     <a:prstGeom prst="rect">
                       <a:avLst/>
@@ -2249,9 +2128,6 @@
     <w:p>
       <w:pPr>
         <w:spacing w:after="110" w:line="264" w:lineRule="auto"/>
-        <w:rPr>
-          <w:lang w:val="en-GB"/>
-        </w:rPr>
       </w:pPr>
       <w:r>
         <w:rPr>
@@ -2262,6 +2138,11 @@
         </w:rPr>
         <w:t>Free seats are only a proxy for where there is room, and the proxy breaks down on a nearly full train. Re-running the model at a crush operating point, where about 12 percent of the train’s seats are free at the doors and every stop falls below the 20 percent threshold, shows what happens to a display that still grades carriages by their seat counts:</w:t>
       </w:r>
+    </w:p>
+    <w:p>
+      <w:pPr>
+        <w:spacing w:after="80" w:line="264" w:lineRule="auto"/>
+      </w:pPr>
     </w:p>
     <w:tbl>
       <w:tblPr>
@@ -2695,17 +2576,8 @@
           <w:sz w:val="21"/>
           <w:szCs w:val="21"/>
         </w:rPr>
-        <w:t xml:space="preserve">The first qualification is that a display naming the best carriages makes boarding worse than no display at all, by about two-fifths, even though it flattens the long-run distribution. Showing each carriage's own state and letting passengers choose locally is what produces the benefit, so the passenger display was rebuilt as a positional map and the banner and badges were removed from it. The second is that free seats are only a </w:t>
-      </w:r>
-      <w:r>
-        <w:rPr>
-          <w:rFonts w:ascii="Calibri" w:eastAsia="Calibri" w:hAnsi="Calibri" w:cs="Calibri"/>
-          <w:color w:val="0F172A"/>
-          <w:sz w:val="21"/>
-          <w:szCs w:val="21"/>
-        </w:rPr>
         <w:lastRenderedPageBreak/>
-        <w:t>proxy for where there is room, and on a nearly full train that proxy breaks down: at a crush load, grading carriages by seat count is 11 percent slower than showing nothing, which is why the screen falls back to a single instruction to spread out below a fifth of seats free. At the crush loads where this system would matter most, the right measurement is crowding rather than seats.</w:t>
+        <w:t>The first qualification is that a display naming the best carriages makes boarding worse than no display at all, by about two-fifths, even though it flattens the long-run distribution. Showing each carriage's own state and letting passengers choose locally is what produces the benefit, so the passenger display was rebuilt as a positional map and the banner and badges were removed from it. The second is that free seats are only a proxy for where there is room, and on a nearly full train that proxy breaks down: at a crush load, grading carriages by seat count is 11 percent slower than showing nothing, which is why the screen falls back to a single instruction to spread out below a fifth of seats free. At the crush loads where this system would matter most, the right measurement is crowding rather than seats.</w:t>
       </w:r>
     </w:p>
     <w:p>
@@ -6354,11 +6226,6 @@
     </w:p>
     <w:p>
       <w:pPr>
-        <w:spacing w:after="80" w:line="264" w:lineRule="auto"/>
-      </w:pPr>
-    </w:p>
-    <w:p>
-      <w:pPr>
         <w:pStyle w:val="Heading2"/>
         <w:spacing w:before="200" w:after="100"/>
       </w:pPr>
@@ -6371,7 +6238,7 @@
           <w:sz w:val="23"/>
           <w:szCs w:val="23"/>
         </w:rPr>
-        <w:t>The display cannot see who is about to get off</w:t>
+        <w:t>Walking is not free</w:t>
       </w:r>
     </w:p>
     <w:p>
@@ -6385,8 +6252,753 @@
           <w:sz w:val="21"/>
           <w:szCs w:val="21"/>
         </w:rPr>
-        <w:t xml:space="preserve">The figures quoted so far let the display show free seats as they will be once the passengers leaving at this station have gone. No sensor can know that in advance. A waiting passenger chooses where to stand before </w:t>
-      </w:r>
+        <w:t xml:space="preserve">The model charges nothing for the walk along the platform: it assumes a passenger reads the display while waiting, walks to the suggested carriage before the train arrives, and is standing there when the doors open. That is defensible but carries a requirement. A double-deck coach is about 26 m and a platform walking pace about 1.3 m/s, so the three-carriage limit is roughly 78 m or 60 seconds. The display must therefore show </w:t>
+        <w:lastRenderedPageBreak/>
+        <w:t>the approaching train's state at least a minute before it arrives, and the whole sensing chain has to fit inside that minute. A passenger who does not make it boards where they stand, which is arithmetically identical to not having followed the display, and the compliance sweep already covers that case.</w:t>
+      </w:r>
+    </w:p>
+    <w:p>
+      <w:pPr>
+        <w:spacing w:after="80" w:line="264" w:lineRule="auto"/>
+      </w:pPr>
+    </w:p>
+    <w:tbl>
+      <w:tblPr>
+        <w:tblW w:w="100" w:type="auto"/>
+        <w:tblBorders>
+          <w:top w:val="single" w:sz="2" w:space="0" w:color="CBD5E1"/>
+          <w:left w:val="single" w:sz="2" w:space="0" w:color="CBD5E1"/>
+          <w:bottom w:val="single" w:sz="2" w:space="0" w:color="CBD5E1"/>
+          <w:right w:val="single" w:sz="2" w:space="0" w:color="CBD5E1"/>
+          <w:insideH w:val="single" w:sz="2" w:space="0" w:color="CBD5E1"/>
+          <w:insideV w:val="single" w:sz="2" w:space="0" w:color="CBD5E1"/>
+        </w:tblBorders>
+        <w:tblCellMar>
+          <w:left w:w="10" w:type="dxa"/>
+          <w:right w:w="10" w:type="dxa"/>
+        </w:tblCellMar>
+        <w:tblLook w:val="0000" w:firstRow="0" w:lastRow="0" w:firstColumn="0" w:lastColumn="0" w:noHBand="0" w:noVBand="0"/>
+      </w:tblPr>
+      <w:tblGrid>
+        <w:gridCol w:w="3176"/>
+        <w:gridCol w:w="1493"/>
+        <w:gridCol w:w="1789"/>
+        <w:gridCol w:w="1422"/>
+        <w:gridCol w:w="1420"/>
+      </w:tblGrid>
+      <w:tr>
+        <w:tblPrEx>
+          <w:tblCellMar>
+            <w:top w:w="0" w:type="dxa"/>
+            <w:bottom w:w="0" w:type="dxa"/>
+          </w:tblCellMar>
+        </w:tblPrEx>
+        <w:trPr>
+          <w:tblHeader/>
+        </w:trPr>
+        <w:tc>
+          <w:tcPr>
+            <w:tcW w:w="3200" w:type="dxa"/>
+            <w:shd w:val="clear" w:color="auto" w:fill="F1F5F9"/>
+            <w:tcMar>
+              <w:top w:w="50" w:type="dxa"/>
+              <w:left w:w="100" w:type="dxa"/>
+              <w:bottom w:w="50" w:type="dxa"/>
+              <w:right w:w="100" w:type="dxa"/>
+            </w:tcMar>
+          </w:tcPr>
+          <w:p>
+            <w:pPr>
+              <w:spacing w:line="250" w:lineRule="auto"/>
+            </w:pPr>
+            <w:r>
+              <w:rPr>
+                <w:rFonts w:ascii="Calibri" w:eastAsia="Calibri" w:hAnsi="Calibri" w:cs="Calibri"/>
+                <w:b/>
+                <w:bCs/>
+                <w:color w:val="0F172A"/>
+                <w:sz w:val="18"/>
+                <w:szCs w:val="18"/>
+              </w:rPr>
+              <w:t>Furthest a passenger will walk</w:t>
+            </w:r>
+          </w:p>
+        </w:tc>
+        <w:tc>
+          <w:tcPr>
+            <w:tcW w:w="1500" w:type="dxa"/>
+            <w:shd w:val="clear" w:color="auto" w:fill="F1F5F9"/>
+            <w:tcMar>
+              <w:top w:w="50" w:type="dxa"/>
+              <w:left w:w="100" w:type="dxa"/>
+              <w:bottom w:w="50" w:type="dxa"/>
+              <w:right w:w="100" w:type="dxa"/>
+            </w:tcMar>
+          </w:tcPr>
+          <w:p>
+            <w:pPr>
+              <w:spacing w:line="250" w:lineRule="auto"/>
+              <w:jc w:val="right"/>
+            </w:pPr>
+            <w:r>
+              <w:rPr>
+                <w:rFonts w:ascii="Calibri" w:eastAsia="Calibri" w:hAnsi="Calibri" w:cs="Calibri"/>
+                <w:b/>
+                <w:bCs/>
+                <w:color w:val="0F172A"/>
+                <w:sz w:val="18"/>
+                <w:szCs w:val="18"/>
+              </w:rPr>
+              <w:t>Distance</w:t>
+            </w:r>
+          </w:p>
+        </w:tc>
+        <w:tc>
+          <w:tcPr>
+            <w:tcW w:w="1800" w:type="dxa"/>
+            <w:shd w:val="clear" w:color="auto" w:fill="F1F5F9"/>
+            <w:tcMar>
+              <w:top w:w="50" w:type="dxa"/>
+              <w:left w:w="100" w:type="dxa"/>
+              <w:bottom w:w="50" w:type="dxa"/>
+              <w:right w:w="100" w:type="dxa"/>
+            </w:tcMar>
+          </w:tcPr>
+          <w:p>
+            <w:pPr>
+              <w:spacing w:line="250" w:lineRule="auto"/>
+              <w:jc w:val="right"/>
+            </w:pPr>
+            <w:r>
+              <w:rPr>
+                <w:rFonts w:ascii="Calibri" w:eastAsia="Calibri" w:hAnsi="Calibri" w:cs="Calibri"/>
+                <w:b/>
+                <w:bCs/>
+                <w:color w:val="0F172A"/>
+                <w:sz w:val="18"/>
+                <w:szCs w:val="18"/>
+              </w:rPr>
+              <w:t>Notice needed</w:t>
+            </w:r>
+          </w:p>
+        </w:tc>
+        <w:tc>
+          <w:tcPr>
+            <w:tcW w:w="1430" w:type="dxa"/>
+            <w:shd w:val="clear" w:color="auto" w:fill="F1F5F9"/>
+            <w:tcMar>
+              <w:top w:w="50" w:type="dxa"/>
+              <w:left w:w="100" w:type="dxa"/>
+              <w:bottom w:w="50" w:type="dxa"/>
+              <w:right w:w="100" w:type="dxa"/>
+            </w:tcMar>
+          </w:tcPr>
+          <w:p>
+            <w:pPr>
+              <w:spacing w:line="250" w:lineRule="auto"/>
+              <w:jc w:val="right"/>
+            </w:pPr>
+            <w:r>
+              <w:rPr>
+                <w:rFonts w:ascii="Calibri" w:eastAsia="Calibri" w:hAnsi="Calibri" w:cs="Calibri"/>
+                <w:b/>
+                <w:bCs/>
+                <w:color w:val="0F172A"/>
+                <w:sz w:val="18"/>
+                <w:szCs w:val="18"/>
+              </w:rPr>
+              <w:t>Screen</w:t>
+            </w:r>
+          </w:p>
+        </w:tc>
+        <w:tc>
+          <w:tcPr>
+            <w:tcW w:w="1430" w:type="dxa"/>
+            <w:shd w:val="clear" w:color="auto" w:fill="F1F5F9"/>
+            <w:tcMar>
+              <w:top w:w="50" w:type="dxa"/>
+              <w:left w:w="100" w:type="dxa"/>
+              <w:bottom w:w="50" w:type="dxa"/>
+              <w:right w:w="100" w:type="dxa"/>
+            </w:tcMar>
+          </w:tcPr>
+          <w:p>
+            <w:pPr>
+              <w:spacing w:line="250" w:lineRule="auto"/>
+              <w:jc w:val="right"/>
+            </w:pPr>
+            <w:r>
+              <w:rPr>
+                <w:rFonts w:ascii="Calibri" w:eastAsia="Calibri" w:hAnsi="Calibri" w:cs="Calibri"/>
+                <w:b/>
+                <w:bCs/>
+                <w:color w:val="0F172A"/>
+                <w:sz w:val="18"/>
+                <w:szCs w:val="18"/>
+              </w:rPr>
+              <w:t>App</w:t>
+            </w:r>
+          </w:p>
+        </w:tc>
+      </w:tr>
+      <w:tr>
+        <w:tblPrEx>
+          <w:tblCellMar>
+            <w:top w:w="0" w:type="dxa"/>
+            <w:bottom w:w="0" w:type="dxa"/>
+          </w:tblCellMar>
+        </w:tblPrEx>
+        <w:tc>
+          <w:tcPr>
+            <w:tcW w:w="3200" w:type="dxa"/>
+            <w:tcMar>
+              <w:top w:w="50" w:type="dxa"/>
+              <w:left w:w="100" w:type="dxa"/>
+              <w:bottom w:w="50" w:type="dxa"/>
+              <w:right w:w="100" w:type="dxa"/>
+            </w:tcMar>
+          </w:tcPr>
+          <w:p>
+            <w:pPr>
+              <w:spacing w:line="250" w:lineRule="auto"/>
+            </w:pPr>
+            <w:r>
+              <w:rPr>
+                <w:rFonts w:ascii="Calibri" w:eastAsia="Calibri" w:hAnsi="Calibri" w:cs="Calibri"/>
+                <w:color w:val="0F172A"/>
+                <w:sz w:val="18"/>
+                <w:szCs w:val="18"/>
+              </w:rPr>
+              <w:t>2 carriages</w:t>
+            </w:r>
+          </w:p>
+        </w:tc>
+        <w:tc>
+          <w:tcPr>
+            <w:tcW w:w="1500" w:type="dxa"/>
+            <w:tcMar>
+              <w:top w:w="50" w:type="dxa"/>
+              <w:left w:w="100" w:type="dxa"/>
+              <w:bottom w:w="50" w:type="dxa"/>
+              <w:right w:w="100" w:type="dxa"/>
+            </w:tcMar>
+          </w:tcPr>
+          <w:p>
+            <w:pPr>
+              <w:spacing w:line="250" w:lineRule="auto"/>
+              <w:jc w:val="right"/>
+            </w:pPr>
+            <w:r>
+              <w:rPr>
+                <w:rFonts w:ascii="Calibri" w:eastAsia="Calibri" w:hAnsi="Calibri" w:cs="Calibri"/>
+                <w:color w:val="0F172A"/>
+                <w:sz w:val="18"/>
+                <w:szCs w:val="18"/>
+              </w:rPr>
+              <w:t>52 m</w:t>
+            </w:r>
+          </w:p>
+        </w:tc>
+        <w:tc>
+          <w:tcPr>
+            <w:tcW w:w="1800" w:type="dxa"/>
+            <w:tcMar>
+              <w:top w:w="50" w:type="dxa"/>
+              <w:left w:w="100" w:type="dxa"/>
+              <w:bottom w:w="50" w:type="dxa"/>
+              <w:right w:w="100" w:type="dxa"/>
+            </w:tcMar>
+          </w:tcPr>
+          <w:p>
+            <w:pPr>
+              <w:spacing w:line="250" w:lineRule="auto"/>
+              <w:jc w:val="right"/>
+            </w:pPr>
+            <w:r>
+              <w:rPr>
+                <w:rFonts w:ascii="Calibri" w:eastAsia="Calibri" w:hAnsi="Calibri" w:cs="Calibri"/>
+                <w:color w:val="0F172A"/>
+                <w:sz w:val="18"/>
+                <w:szCs w:val="18"/>
+              </w:rPr>
+              <w:t>40 s</w:t>
+            </w:r>
+          </w:p>
+        </w:tc>
+        <w:tc>
+          <w:tcPr>
+            <w:tcW w:w="1430" w:type="dxa"/>
+            <w:tcMar>
+              <w:top w:w="50" w:type="dxa"/>
+              <w:left w:w="100" w:type="dxa"/>
+              <w:bottom w:w="50" w:type="dxa"/>
+              <w:right w:w="100" w:type="dxa"/>
+            </w:tcMar>
+          </w:tcPr>
+          <w:p>
+            <w:pPr>
+              <w:spacing w:line="250" w:lineRule="auto"/>
+              <w:jc w:val="right"/>
+            </w:pPr>
+            <w:r>
+              <w:rPr>
+                <w:rFonts w:ascii="Calibri" w:eastAsia="Calibri" w:hAnsi="Calibri" w:cs="Calibri"/>
+                <w:color w:val="0F172A"/>
+                <w:sz w:val="18"/>
+                <w:szCs w:val="18"/>
+              </w:rPr>
+              <w:t>19%</w:t>
+            </w:r>
+          </w:p>
+        </w:tc>
+        <w:tc>
+          <w:tcPr>
+            <w:tcW w:w="1430" w:type="dxa"/>
+            <w:tcMar>
+              <w:top w:w="50" w:type="dxa"/>
+              <w:left w:w="100" w:type="dxa"/>
+              <w:bottom w:w="50" w:type="dxa"/>
+              <w:right w:w="100" w:type="dxa"/>
+            </w:tcMar>
+          </w:tcPr>
+          <w:p>
+            <w:pPr>
+              <w:spacing w:line="250" w:lineRule="auto"/>
+              <w:jc w:val="right"/>
+            </w:pPr>
+            <w:r>
+              <w:rPr>
+                <w:rFonts w:ascii="Calibri" w:eastAsia="Calibri" w:hAnsi="Calibri" w:cs="Calibri"/>
+                <w:color w:val="0F172A"/>
+                <w:sz w:val="18"/>
+                <w:szCs w:val="18"/>
+              </w:rPr>
+              <w:t>39%</w:t>
+            </w:r>
+          </w:p>
+        </w:tc>
+      </w:tr>
+      <w:tr>
+        <w:tblPrEx>
+          <w:tblCellMar>
+            <w:top w:w="0" w:type="dxa"/>
+            <w:bottom w:w="0" w:type="dxa"/>
+          </w:tblCellMar>
+        </w:tblPrEx>
+        <w:tc>
+          <w:tcPr>
+            <w:tcW w:w="3200" w:type="dxa"/>
+            <w:tcMar>
+              <w:top w:w="50" w:type="dxa"/>
+              <w:left w:w="100" w:type="dxa"/>
+              <w:bottom w:w="50" w:type="dxa"/>
+              <w:right w:w="100" w:type="dxa"/>
+            </w:tcMar>
+          </w:tcPr>
+          <w:p>
+            <w:pPr>
+              <w:spacing w:line="250" w:lineRule="auto"/>
+            </w:pPr>
+            <w:r>
+              <w:rPr>
+                <w:rFonts w:ascii="Calibri" w:eastAsia="Calibri" w:hAnsi="Calibri" w:cs="Calibri"/>
+                <w:color w:val="0F172A"/>
+                <w:sz w:val="18"/>
+                <w:szCs w:val="18"/>
+              </w:rPr>
+              <w:t>3 carriages</w:t>
+            </w:r>
+          </w:p>
+        </w:tc>
+        <w:tc>
+          <w:tcPr>
+            <w:tcW w:w="1500" w:type="dxa"/>
+            <w:tcMar>
+              <w:top w:w="50" w:type="dxa"/>
+              <w:left w:w="100" w:type="dxa"/>
+              <w:bottom w:w="50" w:type="dxa"/>
+              <w:right w:w="100" w:type="dxa"/>
+            </w:tcMar>
+          </w:tcPr>
+          <w:p>
+            <w:pPr>
+              <w:spacing w:line="250" w:lineRule="auto"/>
+              <w:jc w:val="right"/>
+            </w:pPr>
+            <w:r>
+              <w:rPr>
+                <w:rFonts w:ascii="Calibri" w:eastAsia="Calibri" w:hAnsi="Calibri" w:cs="Calibri"/>
+                <w:color w:val="0F172A"/>
+                <w:sz w:val="18"/>
+                <w:szCs w:val="18"/>
+              </w:rPr>
+              <w:t>78 m</w:t>
+            </w:r>
+          </w:p>
+        </w:tc>
+        <w:tc>
+          <w:tcPr>
+            <w:tcW w:w="1800" w:type="dxa"/>
+            <w:tcMar>
+              <w:top w:w="50" w:type="dxa"/>
+              <w:left w:w="100" w:type="dxa"/>
+              <w:bottom w:w="50" w:type="dxa"/>
+              <w:right w:w="100" w:type="dxa"/>
+            </w:tcMar>
+          </w:tcPr>
+          <w:p>
+            <w:pPr>
+              <w:spacing w:line="250" w:lineRule="auto"/>
+              <w:jc w:val="right"/>
+            </w:pPr>
+            <w:r>
+              <w:rPr>
+                <w:rFonts w:ascii="Calibri" w:eastAsia="Calibri" w:hAnsi="Calibri" w:cs="Calibri"/>
+                <w:color w:val="0F172A"/>
+                <w:sz w:val="18"/>
+                <w:szCs w:val="18"/>
+              </w:rPr>
+              <w:t>60 s</w:t>
+            </w:r>
+          </w:p>
+        </w:tc>
+        <w:tc>
+          <w:tcPr>
+            <w:tcW w:w="1430" w:type="dxa"/>
+            <w:tcMar>
+              <w:top w:w="50" w:type="dxa"/>
+              <w:left w:w="100" w:type="dxa"/>
+              <w:bottom w:w="50" w:type="dxa"/>
+              <w:right w:w="100" w:type="dxa"/>
+            </w:tcMar>
+          </w:tcPr>
+          <w:p>
+            <w:pPr>
+              <w:spacing w:line="250" w:lineRule="auto"/>
+              <w:jc w:val="right"/>
+            </w:pPr>
+            <w:r>
+              <w:rPr>
+                <w:rFonts w:ascii="Calibri" w:eastAsia="Calibri" w:hAnsi="Calibri" w:cs="Calibri"/>
+                <w:color w:val="0F172A"/>
+                <w:sz w:val="18"/>
+                <w:szCs w:val="18"/>
+              </w:rPr>
+              <w:t>22%</w:t>
+            </w:r>
+          </w:p>
+        </w:tc>
+        <w:tc>
+          <w:tcPr>
+            <w:tcW w:w="1430" w:type="dxa"/>
+            <w:tcMar>
+              <w:top w:w="50" w:type="dxa"/>
+              <w:left w:w="100" w:type="dxa"/>
+              <w:bottom w:w="50" w:type="dxa"/>
+              <w:right w:w="100" w:type="dxa"/>
+            </w:tcMar>
+          </w:tcPr>
+          <w:p>
+            <w:pPr>
+              <w:spacing w:line="250" w:lineRule="auto"/>
+              <w:jc w:val="right"/>
+            </w:pPr>
+            <w:r>
+              <w:rPr>
+                <w:rFonts w:ascii="Calibri" w:eastAsia="Calibri" w:hAnsi="Calibri" w:cs="Calibri"/>
+                <w:color w:val="0F172A"/>
+                <w:sz w:val="18"/>
+                <w:szCs w:val="18"/>
+              </w:rPr>
+              <w:t>43%</w:t>
+            </w:r>
+          </w:p>
+        </w:tc>
+      </w:tr>
+      <w:tr>
+        <w:tblPrEx>
+          <w:tblCellMar>
+            <w:top w:w="0" w:type="dxa"/>
+            <w:bottom w:w="0" w:type="dxa"/>
+          </w:tblCellMar>
+        </w:tblPrEx>
+        <w:tc>
+          <w:tcPr>
+            <w:tcW w:w="3200" w:type="dxa"/>
+            <w:tcMar>
+              <w:top w:w="50" w:type="dxa"/>
+              <w:left w:w="100" w:type="dxa"/>
+              <w:bottom w:w="50" w:type="dxa"/>
+              <w:right w:w="100" w:type="dxa"/>
+            </w:tcMar>
+          </w:tcPr>
+          <w:p>
+            <w:pPr>
+              <w:spacing w:line="250" w:lineRule="auto"/>
+            </w:pPr>
+            <w:r>
+              <w:rPr>
+                <w:rFonts w:ascii="Calibri" w:eastAsia="Calibri" w:hAnsi="Calibri" w:cs="Calibri"/>
+                <w:color w:val="0F172A"/>
+                <w:sz w:val="18"/>
+                <w:szCs w:val="18"/>
+              </w:rPr>
+              <w:t>4 carriages</w:t>
+            </w:r>
+          </w:p>
+        </w:tc>
+        <w:tc>
+          <w:tcPr>
+            <w:tcW w:w="1500" w:type="dxa"/>
+            <w:tcMar>
+              <w:top w:w="50" w:type="dxa"/>
+              <w:left w:w="100" w:type="dxa"/>
+              <w:bottom w:w="50" w:type="dxa"/>
+              <w:right w:w="100" w:type="dxa"/>
+            </w:tcMar>
+          </w:tcPr>
+          <w:p>
+            <w:pPr>
+              <w:spacing w:line="250" w:lineRule="auto"/>
+              <w:jc w:val="right"/>
+            </w:pPr>
+            <w:r>
+              <w:rPr>
+                <w:rFonts w:ascii="Calibri" w:eastAsia="Calibri" w:hAnsi="Calibri" w:cs="Calibri"/>
+                <w:color w:val="0F172A"/>
+                <w:sz w:val="18"/>
+                <w:szCs w:val="18"/>
+              </w:rPr>
+              <w:t>104 m</w:t>
+            </w:r>
+          </w:p>
+        </w:tc>
+        <w:tc>
+          <w:tcPr>
+            <w:tcW w:w="1800" w:type="dxa"/>
+            <w:tcMar>
+              <w:top w:w="50" w:type="dxa"/>
+              <w:left w:w="100" w:type="dxa"/>
+              <w:bottom w:w="50" w:type="dxa"/>
+              <w:right w:w="100" w:type="dxa"/>
+            </w:tcMar>
+          </w:tcPr>
+          <w:p>
+            <w:pPr>
+              <w:spacing w:line="250" w:lineRule="auto"/>
+              <w:jc w:val="right"/>
+            </w:pPr>
+            <w:r>
+              <w:rPr>
+                <w:rFonts w:ascii="Calibri" w:eastAsia="Calibri" w:hAnsi="Calibri" w:cs="Calibri"/>
+                <w:color w:val="0F172A"/>
+                <w:sz w:val="18"/>
+                <w:szCs w:val="18"/>
+              </w:rPr>
+              <w:t>80 s</w:t>
+            </w:r>
+          </w:p>
+        </w:tc>
+        <w:tc>
+          <w:tcPr>
+            <w:tcW w:w="1430" w:type="dxa"/>
+            <w:tcMar>
+              <w:top w:w="50" w:type="dxa"/>
+              <w:left w:w="100" w:type="dxa"/>
+              <w:bottom w:w="50" w:type="dxa"/>
+              <w:right w:w="100" w:type="dxa"/>
+            </w:tcMar>
+          </w:tcPr>
+          <w:p>
+            <w:pPr>
+              <w:spacing w:line="250" w:lineRule="auto"/>
+              <w:jc w:val="right"/>
+            </w:pPr>
+            <w:r>
+              <w:rPr>
+                <w:rFonts w:ascii="Calibri" w:eastAsia="Calibri" w:hAnsi="Calibri" w:cs="Calibri"/>
+                <w:color w:val="0F172A"/>
+                <w:sz w:val="18"/>
+                <w:szCs w:val="18"/>
+              </w:rPr>
+              <w:t>25%</w:t>
+            </w:r>
+          </w:p>
+        </w:tc>
+        <w:tc>
+          <w:tcPr>
+            <w:tcW w:w="1430" w:type="dxa"/>
+            <w:tcMar>
+              <w:top w:w="50" w:type="dxa"/>
+              <w:left w:w="100" w:type="dxa"/>
+              <w:bottom w:w="50" w:type="dxa"/>
+              <w:right w:w="100" w:type="dxa"/>
+            </w:tcMar>
+          </w:tcPr>
+          <w:p>
+            <w:pPr>
+              <w:spacing w:line="250" w:lineRule="auto"/>
+              <w:jc w:val="right"/>
+            </w:pPr>
+            <w:r>
+              <w:rPr>
+                <w:rFonts w:ascii="Calibri" w:eastAsia="Calibri" w:hAnsi="Calibri" w:cs="Calibri"/>
+                <w:color w:val="0F172A"/>
+                <w:sz w:val="18"/>
+                <w:szCs w:val="18"/>
+              </w:rPr>
+              <w:t>45%</w:t>
+            </w:r>
+          </w:p>
+        </w:tc>
+      </w:tr>
+      <w:tr>
+        <w:tblPrEx>
+          <w:tblCellMar>
+            <w:top w:w="0" w:type="dxa"/>
+            <w:bottom w:w="0" w:type="dxa"/>
+          </w:tblCellMar>
+        </w:tblPrEx>
+        <w:tc>
+          <w:tcPr>
+            <w:tcW w:w="3200" w:type="dxa"/>
+            <w:tcMar>
+              <w:top w:w="50" w:type="dxa"/>
+              <w:left w:w="100" w:type="dxa"/>
+              <w:bottom w:w="50" w:type="dxa"/>
+              <w:right w:w="100" w:type="dxa"/>
+            </w:tcMar>
+          </w:tcPr>
+          <w:p>
+            <w:pPr>
+              <w:spacing w:line="250" w:lineRule="auto"/>
+            </w:pPr>
+            <w:r>
+              <w:rPr>
+                <w:rFonts w:ascii="Calibri" w:eastAsia="Calibri" w:hAnsi="Calibri" w:cs="Calibri"/>
+                <w:color w:val="0F172A"/>
+                <w:sz w:val="18"/>
+                <w:szCs w:val="18"/>
+              </w:rPr>
+              <w:t>6 carriages</w:t>
+            </w:r>
+          </w:p>
+        </w:tc>
+        <w:tc>
+          <w:tcPr>
+            <w:tcW w:w="1500" w:type="dxa"/>
+            <w:tcMar>
+              <w:top w:w="50" w:type="dxa"/>
+              <w:left w:w="100" w:type="dxa"/>
+              <w:bottom w:w="50" w:type="dxa"/>
+              <w:right w:w="100" w:type="dxa"/>
+            </w:tcMar>
+          </w:tcPr>
+          <w:p>
+            <w:pPr>
+              <w:spacing w:line="250" w:lineRule="auto"/>
+              <w:jc w:val="right"/>
+            </w:pPr>
+            <w:r>
+              <w:rPr>
+                <w:rFonts w:ascii="Calibri" w:eastAsia="Calibri" w:hAnsi="Calibri" w:cs="Calibri"/>
+                <w:color w:val="0F172A"/>
+                <w:sz w:val="18"/>
+                <w:szCs w:val="18"/>
+              </w:rPr>
+              <w:t>156 m</w:t>
+            </w:r>
+          </w:p>
+        </w:tc>
+        <w:tc>
+          <w:tcPr>
+            <w:tcW w:w="1800" w:type="dxa"/>
+            <w:tcMar>
+              <w:top w:w="50" w:type="dxa"/>
+              <w:left w:w="100" w:type="dxa"/>
+              <w:bottom w:w="50" w:type="dxa"/>
+              <w:right w:w="100" w:type="dxa"/>
+            </w:tcMar>
+          </w:tcPr>
+          <w:p>
+            <w:pPr>
+              <w:spacing w:line="250" w:lineRule="auto"/>
+              <w:jc w:val="right"/>
+            </w:pPr>
+            <w:r>
+              <w:rPr>
+                <w:rFonts w:ascii="Calibri" w:eastAsia="Calibri" w:hAnsi="Calibri" w:cs="Calibri"/>
+                <w:color w:val="0F172A"/>
+                <w:sz w:val="18"/>
+                <w:szCs w:val="18"/>
+              </w:rPr>
+              <w:t>120 s</w:t>
+            </w:r>
+          </w:p>
+        </w:tc>
+        <w:tc>
+          <w:tcPr>
+            <w:tcW w:w="1430" w:type="dxa"/>
+            <w:tcMar>
+              <w:top w:w="50" w:type="dxa"/>
+              <w:left w:w="100" w:type="dxa"/>
+              <w:bottom w:w="50" w:type="dxa"/>
+              <w:right w:w="100" w:type="dxa"/>
+            </w:tcMar>
+          </w:tcPr>
+          <w:p>
+            <w:pPr>
+              <w:spacing w:line="250" w:lineRule="auto"/>
+              <w:jc w:val="right"/>
+            </w:pPr>
+            <w:r>
+              <w:rPr>
+                <w:rFonts w:ascii="Calibri" w:eastAsia="Calibri" w:hAnsi="Calibri" w:cs="Calibri"/>
+                <w:color w:val="0F172A"/>
+                <w:sz w:val="18"/>
+                <w:szCs w:val="18"/>
+              </w:rPr>
+              <w:t>29%</w:t>
+            </w:r>
+          </w:p>
+        </w:tc>
+        <w:tc>
+          <w:tcPr>
+            <w:tcW w:w="1430" w:type="dxa"/>
+            <w:tcMar>
+              <w:top w:w="50" w:type="dxa"/>
+              <w:left w:w="100" w:type="dxa"/>
+              <w:bottom w:w="50" w:type="dxa"/>
+              <w:right w:w="100" w:type="dxa"/>
+            </w:tcMar>
+          </w:tcPr>
+          <w:p>
+            <w:pPr>
+              <w:spacing w:line="250" w:lineRule="auto"/>
+              <w:jc w:val="right"/>
+            </w:pPr>
+            <w:r>
+              <w:rPr>
+                <w:rFonts w:ascii="Calibri" w:eastAsia="Calibri" w:hAnsi="Calibri" w:cs="Calibri"/>
+                <w:color w:val="0F172A"/>
+                <w:sz w:val="18"/>
+                <w:szCs w:val="18"/>
+              </w:rPr>
+              <w:t>45%</w:t>
+            </w:r>
+          </w:p>
+        </w:tc>
+      </w:tr>
+    </w:tbl>
+    <w:p>
+      <w:pPr>
+        <w:spacing w:after="100" w:line="264" w:lineRule="auto"/>
+      </w:pPr>
+    </w:p>
+    <w:p>
+      <w:pPr>
+        <w:spacing w:after="110" w:line="264" w:lineRule="auto"/>
+      </w:pPr>
       <w:r>
         <w:rPr>
           <w:rFonts w:ascii="Calibri" w:eastAsia="Calibri" w:hAnsi="Calibri" w:cs="Calibri"/>
@@ -6394,8 +7006,38 @@
           <w:sz w:val="21"/>
           <w:szCs w:val="21"/>
         </w:rPr>
-        <w:lastRenderedPageBreak/>
-        <w:t>the train arrives, so what they can actually be shown is what the sensors see on approach, with the alighting still to come. Re-running every scenario on that basis is the honest test:</w:t>
+        <w:t>Even one carriage of movement and twenty seconds of notice recovers 14 percent on a screen and 32 percent through an application. The application saturates at about four carriages, because beyond that the balancing is limited by where passengers start rather than by how far they will go.</w:t>
+      </w:r>
+    </w:p>
+    <w:p>
+      <w:pPr>
+        <w:pStyle w:val="Heading2"/>
+        <w:spacing w:before="200" w:after="100"/>
+      </w:pPr>
+      <w:r>
+        <w:rPr>
+          <w:rFonts w:ascii="Calibri" w:eastAsia="Calibri" w:hAnsi="Calibri" w:cs="Calibri"/>
+          <w:b/>
+          <w:bCs/>
+          <w:color w:val="0F172A"/>
+          <w:sz w:val="23"/>
+          <w:szCs w:val="23"/>
+        </w:rPr>
+        <w:t>The display cannot see who is about to get off</w:t>
+      </w:r>
+    </w:p>
+    <w:p>
+      <w:pPr>
+        <w:spacing w:after="110" w:line="264" w:lineRule="auto"/>
+      </w:pPr>
+      <w:r>
+        <w:rPr>
+          <w:rFonts w:ascii="Calibri" w:eastAsia="Calibri" w:hAnsi="Calibri" w:cs="Calibri"/>
+          <w:color w:val="0F172A"/>
+          <w:sz w:val="21"/>
+          <w:szCs w:val="21"/>
+        </w:rPr>
+        <w:t>The figures quoted so far let the display show free seats as they will be once the passengers leaving at this station have gone. No sensor can know that in advance. A waiting passenger chooses where to stand before the train arrives, so what they can actually be shown is what the sensors see on approach, with the alighting still to come. Re-running every scenario on that basis is the honest test:</w:t>
       </w:r>
     </w:p>
     <w:p>
@@ -7699,6 +8341,7 @@
           <w:sz w:val="21"/>
           <w:szCs w:val="21"/>
         </w:rPr>
+        <w:lastRenderedPageBreak/>
         <w:t>The benefit saturates near 70 percent, beyond which the walking limit rather than the advice constrains the spreading. A realistic application reach of 10 to 20 percent sits at the lower end, saving 11 to 22 percent on its own, which is why the platform screen remains worth building alongside it. Combining the two gives 32 percent, against 22 percent for either alone.</w:t>
       </w:r>
     </w:p>
@@ -7769,7 +8412,7 @@
           <w:sz w:val="18"/>
           <w:szCs w:val="18"/>
         </w:rPr>
-        <w:t>Reproduced from Presentation/PROGRAMMER_MANUAL.md in the project repository as submitted for stage 2. Stage 3 superseded the recommendation policy described in it; Sections 4 and 5 of this document describe what replaced it.</w:t>
+        <w:t xml:space="preserve">Reproduced from Presentation/PROGRAMMER_MANUAL.md as submitted for stage 2. Its car ranking now feeds only the retained stage 2 page; the stage 3 interfaces (Section 4, Appendix E) never read it.</w:t>
       </w:r>
     </w:p>
     <w:p>
@@ -12126,8 +12769,7 @@
           <w:sz w:val="28"/>
           <w:szCs w:val="28"/>
         </w:rPr>
-        <w:lastRenderedPageBreak/>
-        <w:t>Appendix E — Stage 2 user guide</w:t>
+        <w:t xml:space="preserve">Appendix E — Stage 3 user guide</w:t>
       </w:r>
     </w:p>
     <w:p>
@@ -12143,7 +12785,7 @@
           <w:sz w:val="18"/>
           <w:szCs w:val="18"/>
         </w:rPr>
-        <w:t>Reproduced from Presentation/USER_MANUAL.md in the project repository as submitted for stage 2.</w:t>
+        <w:t xml:space="preserve">Updated for stage 3 from Presentation/USER_MANUAL.md and PC_software/PASSENGER_INTERFACES.md in the project repository.</w:t>
       </w:r>
     </w:p>
     <w:p>
@@ -12160,7 +12802,7 @@
           <w:sz w:val="23"/>
           <w:szCs w:val="23"/>
         </w:rPr>
-        <w:t>SmartRail — user manual</w:t>
+        <w:t xml:space="preserve">SmartRail — user manual</w:t>
       </w:r>
     </w:p>
     <w:p>
@@ -12174,7 +12816,7 @@
           <w:sz w:val="19"/>
           <w:szCs w:val="19"/>
         </w:rPr>
-        <w:t>Audience: demonstrator/operator and someone viewing the passenger display.</w:t>
+        <w:t xml:space="preserve">Audience: demonstrator/operator, and passengers using the platform screen or phone app.</w:t>
       </w:r>
     </w:p>
     <w:p>
@@ -12188,7 +12830,7 @@
           <w:sz w:val="19"/>
           <w:szCs w:val="19"/>
         </w:rPr>
-        <w:t>Version described: source 0883d93, reviewed 13 October 2026.</w:t>
+        <w:t xml:space="preserve">Version described: source b549083 (stage 3), reviewed 25 October 2026.</w:t>
       </w:r>
     </w:p>
     <w:p>
@@ -12202,7 +12844,7 @@
           <w:sz w:val="19"/>
           <w:szCs w:val="19"/>
         </w:rPr>
-        <w:t>Scope: current 12-car prototype. Physical testing must be completed by the teammates with the board; this manual does not certify their hardware.</w:t>
+        <w:t xml:space="preserve">Scope: current 12-car prototype. Physical testing must be completed with the board; this manual does not certify the hardware.</w:t>
       </w:r>
     </w:p>
     <w:p>
@@ -12219,7 +12861,7 @@
           <w:sz w:val="21"/>
           <w:szCs w:val="21"/>
         </w:rPr>
-        <w:t>1. What the system does</w:t>
+        <w:t xml:space="preserve">1. What the system does</w:t>
       </w:r>
     </w:p>
     <w:p>
@@ -12233,7 +12875,7 @@
           <w:sz w:val="19"/>
           <w:szCs w:val="19"/>
         </w:rPr>
-        <w:t>The passenger page shows available seats in 12 logical train cars A–L. Each car has 108 seats. The control page lets the operator change simulated seats, run simulated station stops and connect two real sensor inputs.</w:t>
+        <w:t xml:space="preserve">Seat states for 12 cars, A–L, of 108 seats each reach passengers through two interfaces:</w:t>
       </w:r>
     </w:p>
     <w:p>
@@ -12252,7 +12894,7 @@
           <w:sz w:val="19"/>
           <w:szCs w:val="19"/>
         </w:rPr>
-        <w:t>Simulation mode: 1,296 simulated seats; no ESP32 required.</w:t>
+        <w:t xml:space="preserve">Platform screen: a positional map of the arriving train for everyone waiting. Each carriage shows its own state where it stops; nothing is ranked or named.</w:t>
       </w:r>
     </w:p>
     <w:p>
@@ -12271,7 +12913,38 @@
           <w:sz w:val="19"/>
           <w:szCs w:val="19"/>
         </w:rPr>
-        <w:t>Hybrid mode: A1 and B1 are real sensor seats, with 1,294 simulated seats.</w:t>
+        <w:t xml:space="preserve">Phone app: a dispatcher for one passenger. You enter your platform zone and receive a single assigned carriage; the next person is sent elsewhere.</w:t>
+      </w:r>
+    </w:p>
+    <w:p>
+      <w:pPr>
+        <w:spacing w:after="110" w:line="264" w:lineRule="auto"/>
+      </w:pPr>
+      <w:r>
+        <w:rPr>
+          <w:rFonts w:ascii="Calibri" w:eastAsia="Calibri" w:hAnsi="Calibri" w:cs="Calibri"/>
+          <w:color w:val="0F172A"/>
+          <w:sz w:val="19"/>
+          <w:szCs w:val="19"/>
+        </w:rPr>
+        <w:t xml:space="preserve">The operator's Controls page changes simulated seats, runs simulated stops and connects two real sensors (hybrid mode: A1 and B1 real, 1,294 seats simulated). Counts and assignments are guidance, not reservations; stations are simulated, not live train tracking.</w:t>
+      </w:r>
+    </w:p>
+    <w:p>
+      <w:pPr>
+        <w:pStyle w:val="Heading3"/>
+        <w:spacing w:before="160" w:after="80"/>
+      </w:pPr>
+      <w:r>
+        <w:rPr>
+          <w:rFonts w:ascii="Calibri" w:eastAsia="Calibri" w:hAnsi="Calibri" w:cs="Calibri"/>
+          <w:b/>
+          <w:bCs/>
+          <w:color w:val="475569"/>
+          <w:sz w:val="21"/>
+          <w:szCs w:val="21"/>
+        </w:rPr>
+        <w:t xml:space="preserve">2. What you need</w:t>
       </w:r>
     </w:p>
     <w:p>
@@ -12290,7 +12963,7 @@
           <w:sz w:val="19"/>
           <w:szCs w:val="19"/>
         </w:rPr>
-        <w:t>Counts are information, not seat reservations or a guarantee of a place to sit.</w:t>
+        <w:t xml:space="preserve">Software: Windows laptop with Python 3.10 or newer, a web browser, this repository and a virtual environment with the project dependencies. Phones also need a trusted private network shared with the laptop.</w:t>
       </w:r>
     </w:p>
     <w:p>
@@ -12309,7 +12982,21 @@
           <w:sz w:val="19"/>
           <w:szCs w:val="19"/>
         </w:rPr>
-        <w:t>The station number and boarding animation are simulated, not live train tracking.</w:t>
+        <w:t xml:space="preserve">Hybrid: ESP32 DevKit V1 with current firmware; two mounted Sharp analog IR sensors on GPIO34 and GPIO35; USB data cable and CP210x driver; working power, common ground and supply decoupling per ../Documentation/04_HARDWARE.md and 05_WIRING_AND_PINOUT.md.</w:t>
+      </w:r>
+    </w:p>
+    <w:p>
+      <w:pPr>
+        <w:spacing w:after="110" w:line="264" w:lineRule="auto"/>
+      </w:pPr>
+      <w:r>
+        <w:rPr>
+          <w:rFonts w:ascii="Calibri" w:eastAsia="Calibri" w:hAnsi="Calibri" w:cs="Calibri"/>
+          <w:color w:val="0F172A"/>
+          <w:sz w:val="19"/>
+          <w:szCs w:val="19"/>
+        </w:rPr>
+        <w:t xml:space="preserve">Power down before changing wires. Never apply 5 V to an ESP32 signal pin or combine external power with PC USB without an approved arrangement.</w:t>
       </w:r>
     </w:p>
     <w:p>
@@ -12326,7 +13013,67 @@
           <w:sz w:val="21"/>
           <w:szCs w:val="21"/>
         </w:rPr>
-        <w:t>2. What you need</w:t>
+        <w:t xml:space="preserve">3. One-time Windows setup</w:t>
+      </w:r>
+    </w:p>
+    <w:p>
+      <w:pPr>
+        <w:spacing w:after="110" w:line="264" w:lineRule="auto"/>
+      </w:pPr>
+      <w:r>
+        <w:rPr>
+          <w:rFonts w:ascii="Calibri" w:eastAsia="Calibri" w:hAnsi="Calibri" w:cs="Calibri"/>
+          <w:color w:val="0F172A"/>
+          <w:sz w:val="19"/>
+          <w:szCs w:val="19"/>
+        </w:rPr>
+        <w:t xml:space="preserve">In PowerShell, from the repository root (the folder containing ESP32 and PC_software):</w:t>
+      </w:r>
+    </w:p>
+    <w:p>
+      <w:pPr>
+        <w:shd w:val="clear" w:color="auto" w:fill="F1F5F9"/>
+        <w:spacing w:after="60" w:line="250" w:lineRule="auto"/>
+        <w:ind w:left="180" w:right="180"/>
+      </w:pPr>
+      <w:r>
+        <w:rPr>
+          <w:rFonts w:ascii="Consolas" w:eastAsia="Consolas" w:hAnsi="Consolas" w:cs="Consolas"/>
+          <w:color w:val="0F172A"/>
+          <w:sz w:val="18"/>
+          <w:szCs w:val="18"/>
+        </w:rPr>
+        <w:t xml:space="preserve">if (-not (Test-Path .venv)) { py -3 -m venv .venv }</w:t>
+      </w:r>
+    </w:p>
+    <w:p>
+      <w:pPr>
+        <w:shd w:val="clear" w:color="auto" w:fill="F1F5F9"/>
+        <w:spacing w:after="60" w:line="250" w:lineRule="auto"/>
+        <w:ind w:left="180" w:right="180"/>
+      </w:pPr>
+      <w:r>
+        <w:rPr>
+          <w:rFonts w:ascii="Consolas" w:eastAsia="Consolas" w:hAnsi="Consolas" w:cs="Consolas"/>
+          <w:color w:val="0F172A"/>
+          <w:sz w:val="18"/>
+          <w:szCs w:val="18"/>
+        </w:rPr>
+        <w:t xml:space="preserve">.\.venv\Scripts\python.exe -m pip install -r .\PC_software\requirements.txt</w:t>
+      </w:r>
+    </w:p>
+    <w:p>
+      <w:pPr>
+        <w:spacing w:after="110" w:line="264" w:lineRule="auto"/>
+      </w:pPr>
+      <w:r>
+        <w:rPr>
+          <w:rFonts w:ascii="Calibri" w:eastAsia="Calibri" w:hAnsi="Calibri" w:cs="Calibri"/>
+          <w:color w:val="0F172A"/>
+          <w:sz w:val="19"/>
+          <w:szCs w:val="19"/>
+        </w:rPr>
+        <w:t xml:space="preserve">Use python if py is unavailable; install and launch with the same interpreter. For hardware, upload ESP32.ino (../ESP32/ESP32.ino) from Arduino IDE 2.x with the ESP32 core (record the version used), keeping the seats empty through calibration.</w:t>
       </w:r>
     </w:p>
     <w:p>
@@ -12343,17 +13090,12 @@
           <w:sz w:val="21"/>
           <w:szCs w:val="21"/>
         </w:rPr>
-        <w:t>Software-only operation</w:t>
-      </w:r>
-    </w:p>
-    <w:p>
-      <w:pPr>
-        <w:pStyle w:val="ListParagraph"/>
-        <w:numPr>
-          <w:ilvl w:val="0"/>
-          <w:numId w:val="2"/>
-        </w:numPr>
-        <w:spacing w:after="60" w:line="264" w:lineRule="auto"/>
+        <w:t xml:space="preserve">4. Start and stop</w:t>
+      </w:r>
+    </w:p>
+    <w:p>
+      <w:pPr>
+        <w:spacing w:after="110" w:line="264" w:lineRule="auto"/>
       </w:pPr>
       <w:r>
         <w:rPr>
@@ -12362,183 +13104,7 @@
           <w:sz w:val="19"/>
           <w:szCs w:val="19"/>
         </w:rPr>
-        <w:t>Windows laptop with Python 3.10 or newer, a web browser, and this repository.</w:t>
-      </w:r>
-    </w:p>
-    <w:p>
-      <w:pPr>
-        <w:pStyle w:val="ListParagraph"/>
-        <w:numPr>
-          <w:ilvl w:val="0"/>
-          <w:numId w:val="2"/>
-        </w:numPr>
-        <w:spacing w:after="60" w:line="264" w:lineRule="auto"/>
-      </w:pPr>
-      <w:r>
-        <w:rPr>
-          <w:rFonts w:ascii="Calibri" w:eastAsia="Calibri" w:hAnsi="Calibri" w:cs="Calibri"/>
-          <w:color w:val="0F172A"/>
-          <w:sz w:val="19"/>
-          <w:szCs w:val="19"/>
-        </w:rPr>
-        <w:t>A working Python virtual environment with the project dependencies installed.</w:t>
-      </w:r>
-    </w:p>
-    <w:p>
-      <w:pPr>
-        <w:pStyle w:val="ListParagraph"/>
-        <w:numPr>
-          <w:ilvl w:val="0"/>
-          <w:numId w:val="2"/>
-        </w:numPr>
-        <w:spacing w:after="60" w:line="264" w:lineRule="auto"/>
-      </w:pPr>
-      <w:r>
-        <w:rPr>
-          <w:rFonts w:ascii="Calibri" w:eastAsia="Calibri" w:hAnsi="Calibri" w:cs="Calibri"/>
-          <w:color w:val="0F172A"/>
-          <w:sz w:val="19"/>
-          <w:szCs w:val="19"/>
-        </w:rPr>
-        <w:t>Internet for initial installation if dependencies are not already available. The local demo itself needs no cloud service or internet access.</w:t>
-      </w:r>
-    </w:p>
-    <w:p>
-      <w:pPr>
-        <w:pStyle w:val="Heading3"/>
-        <w:spacing w:before="160" w:after="80"/>
-      </w:pPr>
-      <w:r>
-        <w:rPr>
-          <w:rFonts w:ascii="Calibri" w:eastAsia="Calibri" w:hAnsi="Calibri" w:cs="Calibri"/>
-          <w:b/>
-          <w:bCs/>
-          <w:color w:val="475569"/>
-          <w:sz w:val="21"/>
-          <w:szCs w:val="21"/>
-        </w:rPr>
-        <w:t>Hybrid operation</w:t>
-      </w:r>
-    </w:p>
-    <w:p>
-      <w:pPr>
-        <w:pStyle w:val="ListParagraph"/>
-        <w:numPr>
-          <w:ilvl w:val="0"/>
-          <w:numId w:val="2"/>
-        </w:numPr>
-        <w:spacing w:after="60" w:line="264" w:lineRule="auto"/>
-      </w:pPr>
-      <w:r>
-        <w:rPr>
-          <w:rFonts w:ascii="Calibri" w:eastAsia="Calibri" w:hAnsi="Calibri" w:cs="Calibri"/>
-          <w:color w:val="0F172A"/>
-          <w:sz w:val="19"/>
-          <w:szCs w:val="19"/>
-        </w:rPr>
-        <w:t>ESP32 DevKit V1 with the current firmware uploaded.</w:t>
-      </w:r>
-    </w:p>
-    <w:p>
-      <w:pPr>
-        <w:pStyle w:val="ListParagraph"/>
-        <w:numPr>
-          <w:ilvl w:val="0"/>
-          <w:numId w:val="2"/>
-        </w:numPr>
-        <w:spacing w:after="60" w:line="264" w:lineRule="auto"/>
-      </w:pPr>
-      <w:r>
-        <w:rPr>
-          <w:rFonts w:ascii="Calibri" w:eastAsia="Calibri" w:hAnsi="Calibri" w:cs="Calibri"/>
-          <w:color w:val="0F172A"/>
-          <w:sz w:val="19"/>
-          <w:szCs w:val="19"/>
-        </w:rPr>
-        <w:t>Two correctly powered and mounted Sharp analog IR sensors, connected to GPIO34 and GPIO35.</w:t>
-      </w:r>
-    </w:p>
-    <w:p>
-      <w:pPr>
-        <w:pStyle w:val="ListParagraph"/>
-        <w:numPr>
-          <w:ilvl w:val="0"/>
-          <w:numId w:val="2"/>
-        </w:numPr>
-        <w:spacing w:after="60" w:line="264" w:lineRule="auto"/>
-      </w:pPr>
-      <w:r>
-        <w:rPr>
-          <w:rFonts w:ascii="Calibri" w:eastAsia="Calibri" w:hAnsi="Calibri" w:cs="Calibri"/>
-          <w:color w:val="0F172A"/>
-          <w:sz w:val="19"/>
-          <w:szCs w:val="19"/>
-        </w:rPr>
-        <w:t>USB data cable and the correct serial driver (the documented prototype uses CP210x).</w:t>
-      </w:r>
-    </w:p>
-    <w:p>
-      <w:pPr>
-        <w:pStyle w:val="ListParagraph"/>
-        <w:numPr>
-          <w:ilvl w:val="0"/>
-          <w:numId w:val="2"/>
-        </w:numPr>
-        <w:spacing w:after="60" w:line="264" w:lineRule="auto"/>
-      </w:pPr>
-      <w:r>
-        <w:rPr>
-          <w:rFonts w:ascii="Calibri" w:eastAsia="Calibri" w:hAnsi="Calibri" w:cs="Calibri"/>
-          <w:color w:val="0F172A"/>
-          <w:sz w:val="19"/>
-          <w:szCs w:val="19"/>
-        </w:rPr>
-        <w:t>Known working power, common ground and manufacturer-recommended supply decoupling. Follow hardware (../Documentation/04_HARDWARE.md) and wiring (../Documentation/05_WIRING_AND_PINOUT.md) instructions with the hardware operator.</w:t>
-      </w:r>
-    </w:p>
-    <w:p>
-      <w:pPr>
-        <w:spacing w:after="110" w:line="264" w:lineRule="auto"/>
-      </w:pPr>
-      <w:r>
-        <w:rPr>
-          <w:rFonts w:ascii="Calibri" w:eastAsia="Calibri" w:hAnsi="Calibri" w:cs="Calibri"/>
-          <w:color w:val="0F172A"/>
-          <w:sz w:val="19"/>
-          <w:szCs w:val="19"/>
-        </w:rPr>
-        <w:t>Power down before changing wires. Do not apply 5 V to an ESP32 signal pin or combine external power with PC USB without an approved arrangement. Do not put a hand directly against the sensor; use the measured working range.</w:t>
-      </w:r>
-    </w:p>
-    <w:p>
-      <w:pPr>
-        <w:pStyle w:val="Heading3"/>
-        <w:spacing w:before="160" w:after="80"/>
-      </w:pPr>
-      <w:r>
-        <w:rPr>
-          <w:rFonts w:ascii="Calibri" w:eastAsia="Calibri" w:hAnsi="Calibri" w:cs="Calibri"/>
-          <w:b/>
-          <w:bCs/>
-          <w:color w:val="475569"/>
-          <w:sz w:val="21"/>
-          <w:szCs w:val="21"/>
-        </w:rPr>
-        <w:t>3. One-time Windows setup</w:t>
-      </w:r>
-    </w:p>
-    <w:p>
-      <w:pPr>
-        <w:spacing w:after="110" w:line="264" w:lineRule="auto"/>
-      </w:pPr>
-      <w:r>
-        <w:rPr>
-          <w:rFonts w:ascii="Calibri" w:eastAsia="Calibri" w:hAnsi="Calibri" w:cs="Calibri"/>
-          <w:color w:val="0F172A"/>
-          <w:sz w:val="19"/>
-          <w:szCs w:val="19"/>
-        </w:rPr>
-        <w:t>Open PowerShell in the SmartRail repository root—the folder containing ESP32, PC_software and the batch launchers, not the Presentation folder.</w:t>
+        <w:t xml:space="preserve">Passenger interfaces, from the repository root:</w:t>
       </w:r>
     </w:p>
     <w:p>
@@ -12554,23 +13120,7 @@
           <w:sz w:val="18"/>
           <w:szCs w:val="18"/>
         </w:rPr>
-        <w:t>if (-not (Test-Path .venv)) { py -3 -m venv .venv }</w:t>
-      </w:r>
-    </w:p>
-    <w:p>
-      <w:pPr>
-        <w:shd w:val="clear" w:color="auto" w:fill="F1F5F9"/>
-        <w:spacing w:after="60" w:line="250" w:lineRule="auto"/>
-        <w:ind w:left="180" w:right="180"/>
-      </w:pPr>
-      <w:r>
-        <w:rPr>
-          <w:rFonts w:ascii="Consolas" w:eastAsia="Consolas" w:hAnsi="Consolas" w:cs="Consolas"/>
-          <w:color w:val="0F172A"/>
-          <w:sz w:val="18"/>
-          <w:szCs w:val="18"/>
-        </w:rPr>
-        <w:t>.\.venv\Scripts\python.exe -m pip install -r .\PC_software\requirements.txt</w:t>
+        <w:t xml:space="preserve">.\.venv\Scripts\python.exe .\PC_software\passenger_routes.py</w:t>
       </w:r>
     </w:p>
     <w:p>
@@ -12584,83 +13134,7 @@
           <w:sz w:val="19"/>
           <w:szCs w:val="19"/>
         </w:rPr>
-        <w:t>If py is unavailable but a compatible python command works, use python for the environment-creation command. Existing team environments may be reused, but installation and startup must use the same interpreter. Do not overwrite an existing environment without checking it.</w:t>
-      </w:r>
-    </w:p>
-    <w:p>
-      <w:pPr>
-        <w:spacing w:after="110" w:line="264" w:lineRule="auto"/>
-      </w:pPr>
-      <w:r>
-        <w:rPr>
-          <w:rFonts w:ascii="Calibri" w:eastAsia="Calibri" w:hAnsi="Calibri" w:cs="Calibri"/>
-          <w:color w:val="0F172A"/>
-          <w:sz w:val="19"/>
-          <w:szCs w:val="19"/>
-        </w:rPr>
-        <w:t>Firmware setup is separate: use Arduino IDE 2.x and the ESP32 Arduino core, select the actual board/port and upload ESP32.ino (../ESP32/ESP32.ino). The newer setup document reports core 3.0.7; confirm and record the version actually used. Leave the seats empty through startup calibration. Uploading or verifying hardware requires the board; simulation mode does not.</w:t>
-      </w:r>
-    </w:p>
-    <w:p>
-      <w:pPr>
-        <w:pStyle w:val="Heading3"/>
-        <w:spacing w:before="160" w:after="80"/>
-      </w:pPr>
-      <w:r>
-        <w:rPr>
-          <w:rFonts w:ascii="Calibri" w:eastAsia="Calibri" w:hAnsi="Calibri" w:cs="Calibri"/>
-          <w:b/>
-          <w:bCs/>
-          <w:color w:val="475569"/>
-          <w:sz w:val="21"/>
-          <w:szCs w:val="21"/>
-        </w:rPr>
-        <w:t>4. Start and stop</w:t>
-      </w:r>
-    </w:p>
-    <w:p>
-      <w:pPr>
-        <w:spacing w:after="110" w:line="264" w:lineRule="auto"/>
-      </w:pPr>
-      <w:r>
-        <w:rPr>
-          <w:rFonts w:ascii="Calibri" w:eastAsia="Calibri" w:hAnsi="Calibri" w:cs="Calibri"/>
-          <w:color w:val="0F172A"/>
-          <w:sz w:val="19"/>
-          <w:szCs w:val="19"/>
-        </w:rPr>
-        <w:lastRenderedPageBreak/>
-        <w:t>After setup, double-click start_dashboard.bat (../start_dashboard.bat). It starts the server and opens the passenger and control pages. Keep its console window open.</w:t>
-      </w:r>
-    </w:p>
-    <w:p>
-      <w:pPr>
-        <w:spacing w:after="110" w:line="264" w:lineRule="auto"/>
-      </w:pPr>
-      <w:r>
-        <w:rPr>
-          <w:rFonts w:ascii="Calibri" w:eastAsia="Calibri" w:hAnsi="Calibri" w:cs="Calibri"/>
-          <w:color w:val="0F172A"/>
-          <w:sz w:val="19"/>
-          <w:szCs w:val="19"/>
-        </w:rPr>
-        <w:t>Equivalent command from the repository root:</w:t>
-      </w:r>
-    </w:p>
-    <w:p>
-      <w:pPr>
-        <w:shd w:val="clear" w:color="auto" w:fill="F1F5F9"/>
-        <w:spacing w:after="60" w:line="250" w:lineRule="auto"/>
-        <w:ind w:left="180" w:right="180"/>
-      </w:pPr>
-      <w:r>
-        <w:rPr>
-          <w:rFonts w:ascii="Consolas" w:eastAsia="Consolas" w:hAnsi="Consolas" w:cs="Consolas"/>
-          <w:color w:val="0F172A"/>
-          <w:sz w:val="18"/>
-          <w:szCs w:val="18"/>
-        </w:rPr>
-        <w:t>.\.venv\Scripts\python.exe .\PC_software\dashboard.py</w:t>
+        <w:t xml:space="preserve">Operator controls: start_dashboard.bat (../start_dashboard.bat) or .\PC_software\dashboard.py. Keep both consoles open.</w:t>
       </w:r>
     </w:p>
     <w:tbl>
@@ -12719,7 +13193,7 @@
                 <w:sz w:val="18"/>
                 <w:szCs w:val="18"/>
               </w:rPr>
-              <w:t>View</w:t>
+              <w:t xml:space="preserve">View</w:t>
             </w:r>
           </w:p>
         </w:tc>
@@ -12747,7 +13221,7 @@
                 <w:sz w:val="18"/>
                 <w:szCs w:val="18"/>
               </w:rPr>
-              <w:t>Address</w:t>
+              <w:t xml:space="preserve">Address</w:t>
             </w:r>
           </w:p>
         </w:tc>
@@ -12775,7 +13249,7 @@
                 <w:sz w:val="18"/>
                 <w:szCs w:val="18"/>
               </w:rPr>
-              <w:t>Purpose</w:t>
+              <w:t xml:space="preserve">Purpose</w:t>
             </w:r>
           </w:p>
         </w:tc>
@@ -12808,7 +13282,7 @@
                 <w:sz w:val="18"/>
                 <w:szCs w:val="18"/>
               </w:rPr>
-              <w:t>Passenger</w:t>
+              <w:t xml:space="preserve">Platform screen</w:t>
             </w:r>
           </w:p>
         </w:tc>
@@ -12833,7 +13307,7 @@
                 <w:sz w:val="18"/>
                 <w:szCs w:val="18"/>
               </w:rPr>
-              <w:t>http://127.0.0.1:8765/</w:t>
+              <w:t xml:space="preserve">http://127.0.0.1:8766/platform</w:t>
             </w:r>
           </w:p>
         </w:tc>
@@ -12858,7 +13332,7 @@
                 <w:sz w:val="18"/>
                 <w:szCs w:val="18"/>
               </w:rPr>
-              <w:t>Availability, car suggestions, platform zones, simulated station</w:t>
+              <w:t xml:space="preserve">Positional map; add ?zone=F to mark the screen's own zone</w:t>
             </w:r>
           </w:p>
         </w:tc>
@@ -12891,7 +13365,7 @@
                 <w:sz w:val="18"/>
                 <w:szCs w:val="18"/>
               </w:rPr>
-              <w:t>Controls</w:t>
+              <w:t xml:space="preserve">Phone app</w:t>
             </w:r>
           </w:p>
         </w:tc>
@@ -12916,7 +13390,7 @@
                 <w:sz w:val="18"/>
                 <w:szCs w:val="18"/>
               </w:rPr>
-              <w:t>http://127.0.0.1:8765/controls</w:t>
+              <w:t xml:space="preserve">http://127.0.0.1:8766/app</w:t>
             </w:r>
           </w:p>
         </w:tc>
@@ -12941,7 +13415,90 @@
                 <w:sz w:val="18"/>
                 <w:szCs w:val="18"/>
               </w:rPr>
-              <w:t>Seat maps, scenarios, station controls, hardware connection</w:t>
+              <w:t xml:space="preserve">Zone picker and one assigned carriage</w:t>
+            </w:r>
+          </w:p>
+        </w:tc>
+      </w:tr>
+      <w:tr>
+        <w:tblPrEx>
+          <w:tblCellMar>
+            <w:top w:w="0" w:type="dxa"/>
+            <w:bottom w:w="0" w:type="dxa"/>
+          </w:tblCellMar>
+        </w:tblPrEx>
+        <w:tc>
+          <w:tcPr>
+            <w:tcW w:w="3120" w:type="dxa"/>
+            <w:tcMar>
+              <w:top w:w="50" w:type="dxa"/>
+              <w:left w:w="100" w:type="dxa"/>
+              <w:bottom w:w="50" w:type="dxa"/>
+              <w:right w:w="100" w:type="dxa"/>
+            </w:tcMar>
+          </w:tcPr>
+          <w:p>
+            <w:pPr>
+              <w:spacing w:line="250" w:lineRule="auto"/>
+            </w:pPr>
+            <w:r>
+              <w:rPr>
+                <w:rFonts w:ascii="Calibri" w:eastAsia="Calibri" w:hAnsi="Calibri" w:cs="Calibri"/>
+                <w:color w:val="0F172A"/>
+                <w:sz w:val="18"/>
+                <w:szCs w:val="18"/>
+              </w:rPr>
+              <w:t xml:space="preserve">Controls</w:t>
+            </w:r>
+          </w:p>
+        </w:tc>
+        <w:tc>
+          <w:tcPr>
+            <w:tcW w:w="3120" w:type="dxa"/>
+            <w:tcMar>
+              <w:top w:w="50" w:type="dxa"/>
+              <w:left w:w="100" w:type="dxa"/>
+              <w:bottom w:w="50" w:type="dxa"/>
+              <w:right w:w="100" w:type="dxa"/>
+            </w:tcMar>
+          </w:tcPr>
+          <w:p>
+            <w:pPr>
+              <w:spacing w:line="250" w:lineRule="auto"/>
+            </w:pPr>
+            <w:r>
+              <w:rPr>
+                <w:rFonts w:ascii="Calibri" w:eastAsia="Calibri" w:hAnsi="Calibri" w:cs="Calibri"/>
+                <w:color w:val="0F172A"/>
+                <w:sz w:val="18"/>
+                <w:szCs w:val="18"/>
+              </w:rPr>
+              <w:t xml:space="preserve">http://127.0.0.1:8765/controls</w:t>
+            </w:r>
+          </w:p>
+        </w:tc>
+        <w:tc>
+          <w:tcPr>
+            <w:tcW w:w="3120" w:type="dxa"/>
+            <w:tcMar>
+              <w:top w:w="50" w:type="dxa"/>
+              <w:left w:w="100" w:type="dxa"/>
+              <w:bottom w:w="50" w:type="dxa"/>
+              <w:right w:w="100" w:type="dxa"/>
+            </w:tcMar>
+          </w:tcPr>
+          <w:p>
+            <w:pPr>
+              <w:spacing w:line="250" w:lineRule="auto"/>
+            </w:pPr>
+            <w:r>
+              <w:rPr>
+                <w:rFonts w:ascii="Calibri" w:eastAsia="Calibri" w:hAnsi="Calibri" w:cs="Calibri"/>
+                <w:color w:val="0F172A"/>
+                <w:sz w:val="18"/>
+                <w:szCs w:val="18"/>
+              </w:rPr>
+              <w:t xml:space="preserve">Seats, scenarios, stops, hardware connection</w:t>
             </w:r>
           </w:p>
         </w:tc>
@@ -12963,7 +13520,7 @@
           <w:sz w:val="19"/>
           <w:szCs w:val="19"/>
         </w:rPr>
-        <w:t>Use the Full screen button or browser F11 for the passenger display. To stop the server, press Ctrl+C in its terminal. Closing the terminal also stops the display's data source.</w:t>
+        <w:t xml:space="preserve">As submitted, the passenger server simulates its own train (the example scenario) and ignores Controls and the sensors, and start_dashboard.bat still opens the stage 2 display at port 8765. Registering the passenger routes in dashboard.py (PC_software/PASSENGER_INTERFACES.md) fixes both: the screen and app are then served on port 8765, / shows the map, and the stage 2 display is kept at /baseline for comparison only.</w:t>
       </w:r>
     </w:p>
     <w:p>
@@ -12977,37 +13534,7 @@
           <w:sz w:val="19"/>
           <w:szCs w:val="19"/>
         </w:rPr>
-        <w:t>If the HTTP port is occupied, stop the old server or launch with a different port:</w:t>
-      </w:r>
-    </w:p>
-    <w:p>
-      <w:pPr>
-        <w:shd w:val="clear" w:color="auto" w:fill="F1F5F9"/>
-        <w:spacing w:after="60" w:line="250" w:lineRule="auto"/>
-        <w:ind w:left="180" w:right="180"/>
-      </w:pPr>
-      <w:r>
-        <w:rPr>
-          <w:rFonts w:ascii="Consolas" w:eastAsia="Consolas" w:hAnsi="Consolas" w:cs="Consolas"/>
-          <w:color w:val="0F172A"/>
-          <w:sz w:val="18"/>
-          <w:szCs w:val="18"/>
-        </w:rPr>
-        <w:t>.\.venv\Scripts\python.exe .\PC_software\dashboard.py --http-port 8766</w:t>
-      </w:r>
-    </w:p>
-    <w:p>
-      <w:pPr>
-        <w:spacing w:after="110" w:line="264" w:lineRule="auto"/>
-      </w:pPr>
-      <w:r>
-        <w:rPr>
-          <w:rFonts w:ascii="Calibri" w:eastAsia="Calibri" w:hAnsi="Calibri" w:cs="Calibri"/>
-          <w:color w:val="0F172A"/>
-          <w:sz w:val="19"/>
-          <w:szCs w:val="19"/>
-        </w:rPr>
-        <w:t>Use 8766 in both browser URLs in that case. Browser refresh preserves the running server's state. Restarting the server resets the example and station 1; it normally starts in simulation mode. The optional startup argument --serial-port COM5 starts hybrid mode directly—replace COM5 with the actual board port.</w:t>
+        <w:t xml:space="preserve">Press F11 for a full-screen platform display. Stop a server with Ctrl+C; restarting resets its seats, station and assignments. If a port is busy, add --http-port 8767 and use that port. dashboard.py --serial-port COM5 starts hybrid mode directly.</w:t>
       </w:r>
     </w:p>
     <w:p>
@@ -13024,7 +13551,21 @@
           <w:sz w:val="21"/>
           <w:szCs w:val="21"/>
         </w:rPr>
-        <w:t>5. Read the passenger display</w:t>
+        <w:t xml:space="preserve">5. Read the platform screen</w:t>
+      </w:r>
+    </w:p>
+    <w:p>
+      <w:pPr>
+        <w:spacing w:after="110" w:line="264" w:lineRule="auto"/>
+      </w:pPr>
+      <w:r>
+        <w:rPr>
+          <w:rFonts w:ascii="Calibri" w:eastAsia="Calibri" w:hAnsi="Calibri" w:cs="Calibri"/>
+          <w:color w:val="0F172A"/>
+          <w:sz w:val="19"/>
+          <w:szCs w:val="19"/>
+        </w:rPr>
+        <w:t xml:space="preserve">Carriages are drawn in stopping order from the FRONT marker, each above its zone letter. The order never changes with availability, and no carriage is badged or named.</w:t>
       </w:r>
     </w:p>
     <w:tbl>
@@ -13082,7 +13623,7 @@
                 <w:sz w:val="18"/>
                 <w:szCs w:val="18"/>
               </w:rPr>
-              <w:t>Indicator</w:t>
+              <w:t xml:space="preserve">Display</w:t>
             </w:r>
           </w:p>
         </w:tc>
@@ -13110,7 +13651,7 @@
                 <w:sz w:val="18"/>
                 <w:szCs w:val="18"/>
               </w:rPr>
-              <w:t>Meaning</w:t>
+              <w:t xml:space="preserve">Meaning</w:t>
             </w:r>
           </w:p>
         </w:tc>
@@ -13143,7 +13684,7 @@
                 <w:sz w:val="18"/>
                 <w:szCs w:val="18"/>
               </w:rPr>
-              <w:t>Green car</w:t>
+              <w:t xml:space="preserve">“N free”, Seats available (green)</w:t>
             </w:r>
           </w:p>
         </w:tc>
@@ -13168,7 +13709,7 @@
                 <w:sz w:val="18"/>
                 <w:szCs w:val="18"/>
               </w:rPr>
-              <w:t>At least 10 confirmed free seats and no unknown seats</w:t>
+              <w:t xml:space="preserve">10 or more confirmed free seats</w:t>
             </w:r>
           </w:p>
         </w:tc>
@@ -13201,7 +13742,7 @@
                 <w:sz w:val="18"/>
                 <w:szCs w:val="18"/>
               </w:rPr>
-              <w:t>Amber/orange car</w:t>
+              <w:t xml:space="preserve">“N free”, Filling up (yellow)</w:t>
             </w:r>
           </w:p>
         </w:tc>
@@ -13226,7 +13767,7 @@
                 <w:sz w:val="18"/>
                 <w:szCs w:val="18"/>
               </w:rPr>
-              <w:t>1–9 confirmed free seats and no unknown seats</w:t>
+              <w:t xml:space="preserve">1–9 confirmed free seats</w:t>
             </w:r>
           </w:p>
         </w:tc>
@@ -13259,7 +13800,7 @@
                 <w:sz w:val="18"/>
                 <w:szCs w:val="18"/>
               </w:rPr>
-              <w:t>Red / “Full”</w:t>
+              <w:t xml:space="preserve">“No free seats” (red)</w:t>
             </w:r>
           </w:p>
         </w:tc>
@@ -13284,7 +13825,7 @@
                 <w:sz w:val="18"/>
                 <w:szCs w:val="18"/>
               </w:rPr>
-              <w:t>Zero free seats with complete data; only seating is measured, not standing room</w:t>
+              <w:t xml:space="preserve">None free with complete data; standing room is not measured, so boarding is still allowed</w:t>
             </w:r>
           </w:p>
         </w:tc>
@@ -13317,7 +13858,7 @@
                 <w:sz w:val="18"/>
                 <w:szCs w:val="18"/>
               </w:rPr>
-              <w:t>Gray car</w:t>
+              <w:t xml:space="preserve">“Some seats not reported” (gray)</w:t>
             </w:r>
           </w:p>
         </w:tc>
@@ -13342,7 +13883,7 @@
                 <w:sz w:val="18"/>
                 <w:szCs w:val="18"/>
               </w:rPr>
-              <w:t>At least one seat state is unknown; known free seats are still shown separately</w:t>
+              <w:t xml:space="preserve">A sensor is silent; only proven seats are stated, e.g. “At least 3 free, 7 of 108 seats unknown”</w:t>
             </w:r>
           </w:p>
         </w:tc>
@@ -13375,7 +13916,7 @@
                 <w:sz w:val="18"/>
                 <w:szCs w:val="18"/>
               </w:rPr>
-              <w:t>Occupancy percentage</w:t>
+              <w:t xml:space="preserve">“Space here” on every carriage with room</w:t>
             </w:r>
           </w:p>
         </w:tc>
@@ -13400,7 +13941,7 @@
                 <w:sz w:val="18"/>
                 <w:szCs w:val="18"/>
               </w:rPr>
-              <w:t>Confirmed occupied seats divided by all seats; unknown seats are not silently treated as occupied or free</w:t>
+              <w:t xml:space="preserve">Under 20% of seats free: counts are hidden and the banner asks everyone to spread out and use all doors</w:t>
             </w:r>
           </w:p>
         </w:tc>
@@ -13433,7 +13974,7 @@
                 <w:sz w:val="18"/>
                 <w:szCs w:val="18"/>
               </w:rPr>
-              <w:t>Suggested cars</w:t>
+              <w:t xml:space="preserve">“You are here”</w:t>
             </w:r>
           </w:p>
         </w:tc>
@@ -13458,7 +13999,7 @@
                 <w:sz w:val="18"/>
                 <w:szCs w:val="18"/>
               </w:rPr>
-              <w:t>Up to three with the most confirmed free seats; ties alphabetically</w:t>
+              <w:t xml:space="preserve">This screen's zone, set by ?zone= in its address</w:t>
             </w:r>
           </w:p>
         </w:tc>
@@ -13491,7 +14032,7 @@
                 <w:sz w:val="18"/>
                 <w:szCs w:val="18"/>
               </w:rPr>
-              <w:t>Station</w:t>
+              <w:t xml:space="preserve">“Lost contact with the train”</w:t>
             </w:r>
           </w:p>
         </w:tc>
@@ -13516,123 +14057,7 @@
                 <w:sz w:val="18"/>
                 <w:szCs w:val="18"/>
               </w:rPr>
-              <w:t>Simulated station counter, initially 1</w:t>
-            </w:r>
-          </w:p>
-        </w:tc>
-      </w:tr>
-      <w:tr>
-        <w:tblPrEx>
-          <w:tblCellMar>
-            <w:top w:w="0" w:type="dxa"/>
-            <w:bottom w:w="0" w:type="dxa"/>
-          </w:tblCellMar>
-        </w:tblPrEx>
-        <w:tc>
-          <w:tcPr>
-            <w:tcW w:w="4680" w:type="dxa"/>
-            <w:tcMar>
-              <w:top w:w="50" w:type="dxa"/>
-              <w:left w:w="100" w:type="dxa"/>
-              <w:bottom w:w="50" w:type="dxa"/>
-              <w:right w:w="100" w:type="dxa"/>
-            </w:tcMar>
-          </w:tcPr>
-          <w:p>
-            <w:pPr>
-              <w:spacing w:line="250" w:lineRule="auto"/>
-            </w:pPr>
-            <w:r>
-              <w:rPr>
-                <w:rFonts w:ascii="Calibri" w:eastAsia="Calibri" w:hAnsi="Calibri" w:cs="Calibri"/>
-                <w:color w:val="0F172A"/>
-                <w:sz w:val="18"/>
-                <w:szCs w:val="18"/>
-              </w:rPr>
-              <w:t>BOARDING</w:t>
-            </w:r>
-          </w:p>
-        </w:tc>
-        <w:tc>
-          <w:tcPr>
-            <w:tcW w:w="4680" w:type="dxa"/>
-            <w:tcMar>
-              <w:top w:w="50" w:type="dxa"/>
-              <w:left w:w="100" w:type="dxa"/>
-              <w:bottom w:w="50" w:type="dxa"/>
-              <w:right w:w="100" w:type="dxa"/>
-            </w:tcMar>
-          </w:tcPr>
-          <w:p>
-            <w:pPr>
-              <w:spacing w:line="250" w:lineRule="auto"/>
-            </w:pPr>
-            <w:r>
-              <w:rPr>
-                <w:rFonts w:ascii="Calibri" w:eastAsia="Calibri" w:hAnsi="Calibri" w:cs="Calibri"/>
-                <w:color w:val="0F172A"/>
-                <w:sz w:val="18"/>
-                <w:szCs w:val="18"/>
-              </w:rPr>
-              <w:t>A simulated stop is applying its scheduled changes</w:t>
-            </w:r>
-          </w:p>
-        </w:tc>
-      </w:tr>
-      <w:tr>
-        <w:tblPrEx>
-          <w:tblCellMar>
-            <w:top w:w="0" w:type="dxa"/>
-            <w:bottom w:w="0" w:type="dxa"/>
-          </w:tblCellMar>
-        </w:tblPrEx>
-        <w:tc>
-          <w:tcPr>
-            <w:tcW w:w="4680" w:type="dxa"/>
-            <w:tcMar>
-              <w:top w:w="50" w:type="dxa"/>
-              <w:left w:w="100" w:type="dxa"/>
-              <w:bottom w:w="50" w:type="dxa"/>
-              <w:right w:w="100" w:type="dxa"/>
-            </w:tcMar>
-          </w:tcPr>
-          <w:p>
-            <w:pPr>
-              <w:spacing w:line="250" w:lineRule="auto"/>
-            </w:pPr>
-            <w:r>
-              <w:rPr>
-                <w:rFonts w:ascii="Calibri" w:eastAsia="Calibri" w:hAnsi="Calibri" w:cs="Calibri"/>
-                <w:color w:val="0F172A"/>
-                <w:sz w:val="18"/>
-                <w:szCs w:val="18"/>
-              </w:rPr>
-              <w:t>Offline warning / dashes</w:t>
-            </w:r>
-          </w:p>
-        </w:tc>
-        <w:tc>
-          <w:tcPr>
-            <w:tcW w:w="4680" w:type="dxa"/>
-            <w:tcMar>
-              <w:top w:w="50" w:type="dxa"/>
-              <w:left w:w="100" w:type="dxa"/>
-              <w:bottom w:w="50" w:type="dxa"/>
-              <w:right w:w="100" w:type="dxa"/>
-            </w:tcMar>
-          </w:tcPr>
-          <w:p>
-            <w:pPr>
-              <w:spacing w:line="250" w:lineRule="auto"/>
-            </w:pPr>
-            <w:r>
-              <w:rPr>
-                <w:rFonts w:ascii="Calibri" w:eastAsia="Calibri" w:hAnsi="Calibri" w:cs="Calibri"/>
-                <w:color w:val="0F172A"/>
-                <w:sz w:val="18"/>
-                <w:szCs w:val="18"/>
-              </w:rPr>
-              <w:t>Dashboard server unavailable; do not rely on old counts</w:t>
+              <w:t xml:space="preserve">Counts are out of date</w:t>
             </w:r>
           </w:p>
         </w:tc>
@@ -13654,7 +14079,7 @@
           <w:sz w:val="19"/>
           <w:szCs w:val="19"/>
         </w:rPr>
-        <w:t>Platform zones are logical labels matching car letters for this prototype. No real railway stopping-position integration is implemented.</w:t>
+        <w:t xml:space="preserve">Passengers wait by the nearest carriage with space, as the banner says. Zones are logical labels matching car letters; no real stopping-position feed exists.</w:t>
       </w:r>
     </w:p>
     <w:p>
@@ -13671,7 +14096,116 @@
           <w:sz w:val="21"/>
           <w:szCs w:val="21"/>
         </w:rPr>
-        <w:t>6. Simulation controls</w:t>
+        <w:t xml:space="preserve">6. Use the phone app</w:t>
+      </w:r>
+    </w:p>
+    <w:p>
+      <w:pPr>
+        <w:pStyle w:val="ListParagraph"/>
+        <w:numPr>
+          <w:ilvl w:val="0"/>
+          <w:numId w:val="5"/>
+        </w:numPr>
+        <w:spacing w:after="60" w:line="264" w:lineRule="auto"/>
+      </w:pPr>
+      <w:r>
+        <w:rPr>
+          <w:rFonts w:ascii="Calibri" w:eastAsia="Calibri" w:hAnsi="Calibri" w:cs="Calibri"/>
+          <w:color w:val="0F172A"/>
+          <w:sz w:val="19"/>
+          <w:szCs w:val="19"/>
+        </w:rPr>
+        <w:t xml:space="preserve">Open http://127.0.0.1:8766/app, or the network address from Section 9 on a phone. The app lists the twelve platform zones, front to back.</w:t>
+      </w:r>
+    </w:p>
+    <w:p>
+      <w:pPr>
+        <w:pStyle w:val="ListParagraph"/>
+        <w:numPr>
+          <w:ilvl w:val="0"/>
+          <w:numId w:val="5"/>
+        </w:numPr>
+        <w:spacing w:after="60" w:line="264" w:lineRule="auto"/>
+      </w:pPr>
+      <w:r>
+        <w:rPr>
+          <w:rFonts w:ascii="Calibri" w:eastAsia="Calibri" w:hAnsi="Calibri" w:cs="Calibri"/>
+          <w:color w:val="0F172A"/>
+          <w:sz w:val="19"/>
+          <w:szCs w:val="19"/>
+        </w:rPr>
+        <w:t xml:space="preserve">Tap the zone you are standing at. This is the only input.</w:t>
+      </w:r>
+    </w:p>
+    <w:p>
+      <w:pPr>
+        <w:pStyle w:val="ListParagraph"/>
+        <w:numPr>
+          <w:ilvl w:val="0"/>
+          <w:numId w:val="5"/>
+        </w:numPr>
+        <w:spacing w:after="60" w:line="264" w:lineRule="auto"/>
+      </w:pPr>
+      <w:r>
+        <w:rPr>
+          <w:rFonts w:ascii="Calibri" w:eastAsia="Calibri" w:hAnsi="Calibri" w:cs="Calibri"/>
+          <w:color w:val="0F172A"/>
+          <w:sz w:val="19"/>
+          <w:szCs w:val="19"/>
+        </w:rPr>
+        <w:t xml:space="preserve">Read the single assignment: the zone to wait at, “Car X stops here”, the walk (e.g. “2 carriages towards the back”) and the seats confirmed free when you asked.</w:t>
+      </w:r>
+    </w:p>
+    <w:p>
+      <w:pPr>
+        <w:pStyle w:val="ListParagraph"/>
+        <w:numPr>
+          <w:ilvl w:val="0"/>
+          <w:numId w:val="5"/>
+        </w:numPr>
+        <w:spacing w:after="60" w:line="264" w:lineRule="auto"/>
+      </w:pPr>
+      <w:r>
+        <w:rPr>
+          <w:rFonts w:ascii="Calibri" w:eastAsia="Calibri" w:hAnsi="Calibri" w:cs="Calibri"/>
+          <w:color w:val="0F172A"/>
+          <w:sz w:val="19"/>
+          <w:szCs w:val="19"/>
+        </w:rPr>
+        <w:t xml:space="preserve">Walk there. The carriage is held for 3 minutes, shown as a countdown; at zero it expires, and you reload or tap Change my zone to ask again.</w:t>
+      </w:r>
+    </w:p>
+    <w:p>
+      <w:pPr>
+        <w:pStyle w:val="ListParagraph"/>
+        <w:numPr>
+          <w:ilvl w:val="0"/>
+          <w:numId w:val="5"/>
+        </w:numPr>
+        <w:spacing w:after="60" w:line="264" w:lineRule="auto"/>
+      </w:pPr>
+      <w:r>
+        <w:rPr>
+          <w:rFonts w:ascii="Calibri" w:eastAsia="Calibri" w:hAnsi="Calibri" w:cs="Calibri"/>
+          <w:color w:val="0F172A"/>
+          <w:sz w:val="19"/>
+          <w:szCs w:val="19"/>
+        </w:rPr>
+        <w:t xml:space="preserve">Once aboard, tap I have boarded. This, like Change my zone, hands the carriage back for the next passenger.</w:t>
+      </w:r>
+    </w:p>
+    <w:p>
+      <w:pPr>
+        <w:spacing w:after="110" w:line="264" w:lineRule="auto"/>
+      </w:pPr>
+      <w:r>
+        <w:rPr>
+          <w:rFonts w:ascii="Calibri" w:eastAsia="Calibri" w:hAnsi="Calibri" w:cs="Calibri"/>
+          <w:color w:val="0F172A"/>
+          <w:sz w:val="19"/>
+          <w:szCs w:val="19"/>
+        </w:rPr>
+        <w:t xml:space="preserve">Dispatcher rules:</w:t>
       </w:r>
     </w:p>
     <w:p>
@@ -13690,7 +14224,7 @@
           <w:sz w:val="19"/>
           <w:szCs w:val="19"/>
         </w:rPr>
-        <w:t>Open Controls and choose Use simulation if necessary.</w:t>
+        <w:t xml:space="preserve">A repeated request within the 3 minutes (a reload, or reopening the app) returns the same carriage and is not counted twice. The on-screen countdown restarts, but the hold still ends 3 minutes after the first request.</w:t>
       </w:r>
     </w:p>
     <w:p>
@@ -13709,7 +14243,7 @@
           <w:sz w:val="19"/>
           <w:szCs w:val="19"/>
         </w:rPr>
-        <w:t>If auto stops are on, press Stop auto stops before preparing a static scene.</w:t>
+        <w:t xml:space="preserve">Passengers at the same zone get different carriages: within 3 carriages, the app picks the one with a confirmed free seat that the fewest waiting passengers have been sent to. Unknown seats never count as free.</w:t>
       </w:r>
     </w:p>
     <w:p>
@@ -13728,7 +14262,7 @@
           <w:sz w:val="19"/>
           <w:szCs w:val="19"/>
         </w:rPr>
-        <w:t>Click Example scenario · station 1.</w:t>
+        <w:t xml:space="preserve">If nothing within reach confirms a free seat, it still assigns a carriage away from the busiest door, and says so.</w:t>
       </w:r>
     </w:p>
     <w:p>
@@ -13747,21 +14281,7 @@
           <w:sz w:val="19"/>
           <w:szCs w:val="19"/>
         </w:rPr>
-        <w:t>Click a seat in the car maps to switch between empty and occupied. Both views update from the same shared model.</w:t>
-      </w:r>
-    </w:p>
-    <w:p>
-      <w:pPr>
-        <w:spacing w:after="110" w:line="264" w:lineRule="auto"/>
-      </w:pPr>
-      <w:r>
-        <w:rPr>
-          <w:rFonts w:ascii="Calibri" w:eastAsia="Calibri" w:hAnsi="Calibri" w:cs="Calibri"/>
-          <w:color w:val="0F172A"/>
-          <w:sz w:val="19"/>
-          <w:szCs w:val="19"/>
-        </w:rPr>
-        <w:t>Example free counts: A12, B3, C0, D25, E48, F7, G36, H18, I1, J60, K29, L72. Total 311. Suggestions L, J, E. A1 and B1 are occupied in this deterministic software example.</w:t>
+        <w:t xml:space="preserve">All assignments clear when the train departs (the station counter advances). The app never lists carriages or shows other carriages' counts.</w:t>
       </w:r>
     </w:p>
     <w:p>
@@ -13778,7 +14298,21 @@
           <w:sz w:val="21"/>
           <w:szCs w:val="21"/>
         </w:rPr>
-        <w:t>Scenario buttons</w:t>
+        <w:t xml:space="preserve">7. Simulation controls</w:t>
+      </w:r>
+    </w:p>
+    <w:p>
+      <w:pPr>
+        <w:spacing w:after="110" w:line="264" w:lineRule="auto"/>
+      </w:pPr>
+      <w:r>
+        <w:rPr>
+          <w:rFonts w:ascii="Calibri" w:eastAsia="Calibri" w:hAnsi="Calibri" w:cs="Calibri"/>
+          <w:color w:val="0F172A"/>
+          <w:sz w:val="19"/>
+          <w:szCs w:val="19"/>
+        </w:rPr>
+        <w:t xml:space="preserve">Controls reach the screen and app only once the routes are registered (Section 4).</w:t>
       </w:r>
     </w:p>
     <w:p>
@@ -13797,7 +14331,7 @@
           <w:sz w:val="19"/>
           <w:szCs w:val="19"/>
         </w:rPr>
-        <w:t>Example scenario: restores the source-defined simulated pattern.</w:t>
+        <w:t xml:space="preserve">Choose Use simulation if needed, and press Stop auto stops before preparing a static scene.</w:t>
       </w:r>
     </w:p>
     <w:p>
@@ -13816,8 +14350,7 @@
           <w:sz w:val="19"/>
           <w:szCs w:val="19"/>
         </w:rPr>
-        <w:lastRenderedPageBreak/>
-        <w:t>Empty simulated seats: makes all editable seats empty.</w:t>
+        <w:t xml:space="preserve">Example scenario · station 1 restores the example; Empty simulated seats and Occupy simulated seats set every editable seat (A1/B1 are skipped in hybrid mode). Presets reset the station to 1 but do not stop automatic stops.</w:t>
       </w:r>
     </w:p>
     <w:p>
@@ -13836,128 +14369,7 @@
           <w:sz w:val="19"/>
           <w:szCs w:val="19"/>
         </w:rPr>
-        <w:t>Occupy simulated seats: makes all editable seats occupied.</w:t>
-      </w:r>
-    </w:p>
-    <w:p>
-      <w:pPr>
-        <w:spacing w:after="110" w:line="264" w:lineRule="auto"/>
-      </w:pPr>
-      <w:r>
-        <w:rPr>
-          <w:rFonts w:ascii="Calibri" w:eastAsia="Calibri" w:hAnsi="Calibri" w:cs="Calibri"/>
-          <w:color w:val="0F172A"/>
-          <w:sz w:val="19"/>
-          <w:szCs w:val="19"/>
-        </w:rPr>
-        <w:t>Each preset resets the station counter to 1 and clears pending stop animation. It does not turn off automatic stops. In hybrid mode presets skip A1/B1, so totals depend on real readings.</w:t>
-      </w:r>
-    </w:p>
-    <w:p>
-      <w:pPr>
-        <w:pStyle w:val="Heading3"/>
-        <w:spacing w:before="160" w:after="80"/>
-      </w:pPr>
-      <w:r>
-        <w:rPr>
-          <w:rFonts w:ascii="Calibri" w:eastAsia="Calibri" w:hAnsi="Calibri" w:cs="Calibri"/>
-          <w:b/>
-          <w:bCs/>
-          <w:color w:val="475569"/>
-          <w:sz w:val="21"/>
-          <w:szCs w:val="21"/>
-        </w:rPr>
-        <w:t>Next stop</w:t>
-      </w:r>
-    </w:p>
-    <w:p>
-      <w:pPr>
-        <w:spacing w:after="110" w:line="264" w:lineRule="auto"/>
-      </w:pPr>
-      <w:r>
-        <w:rPr>
-          <w:rFonts w:ascii="Calibri" w:eastAsia="Calibri" w:hAnsi="Calibri" w:cs="Calibri"/>
-          <w:color w:val="0F172A"/>
-          <w:sz w:val="19"/>
-          <w:szCs w:val="19"/>
-        </w:rPr>
-        <w:t>Press once and wait for BOARDING to finish. The station advances and simulated passengers leave during the first half of about 2.4 seconds, then others board during the second half. Selections are random and bounded; exact resulting counts are not predictable.</w:t>
-      </w:r>
-    </w:p>
-    <w:p>
-      <w:pPr>
-        <w:spacing w:after="110" w:line="264" w:lineRule="auto"/>
-      </w:pPr>
-      <w:r>
-        <w:rPr>
-          <w:rFonts w:ascii="Calibri" w:eastAsia="Calibri" w:hAnsi="Calibri" w:cs="Calibri"/>
-          <w:color w:val="0F172A"/>
-          <w:sz w:val="19"/>
-          <w:szCs w:val="19"/>
-        </w:rPr>
-        <w:t>This is synthetic occupancy activity, not a quantitative passenger-flow or dwell-time model. Physical seats are never modified by a simulated stop in hybrid mode.</w:t>
-      </w:r>
-    </w:p>
-    <w:p>
-      <w:pPr>
-        <w:pStyle w:val="Heading3"/>
-        <w:spacing w:before="160" w:after="80"/>
-      </w:pPr>
-      <w:r>
-        <w:rPr>
-          <w:rFonts w:ascii="Calibri" w:eastAsia="Calibri" w:hAnsi="Calibri" w:cs="Calibri"/>
-          <w:b/>
-          <w:bCs/>
-          <w:color w:val="475569"/>
-          <w:sz w:val="21"/>
-          <w:szCs w:val="21"/>
-        </w:rPr>
-        <w:t>Automatic stops</w:t>
-      </w:r>
-    </w:p>
-    <w:p>
-      <w:pPr>
-        <w:spacing w:after="110" w:line="264" w:lineRule="auto"/>
-      </w:pPr>
-      <w:r>
-        <w:rPr>
-          <w:rFonts w:ascii="Calibri" w:eastAsia="Calibri" w:hAnsi="Calibri" w:cs="Calibri"/>
-          <w:color w:val="0F172A"/>
-          <w:sz w:val="19"/>
-          <w:szCs w:val="19"/>
-        </w:rPr>
-        <w:t>Choose 5, 10, 15 or 30 seconds, then press Start auto stops. Stops are advanced by browser polling; keep a display tab open. Press Stop auto stops to disable further scheduling. An already-running stop may still finish; wait or use a preset to cancel remaining changes.</w:t>
-      </w:r>
-    </w:p>
-    <w:p>
-      <w:pPr>
-        <w:spacing w:after="110" w:line="264" w:lineRule="auto"/>
-      </w:pPr>
-      <w:r>
-        <w:rPr>
-          <w:rFonts w:ascii="Calibri" w:eastAsia="Calibri" w:hAnsi="Calibri" w:cs="Calibri"/>
-          <w:color w:val="0F172A"/>
-          <w:sz w:val="19"/>
-          <w:szCs w:val="19"/>
-        </w:rPr>
-        <w:t>For a predictable scene: stop auto → wait or load preset → demonstrate. Do not assume changing mode stops auto or resets the station counter; current mode changes do neither.</w:t>
-      </w:r>
-    </w:p>
-    <w:p>
-      <w:pPr>
-        <w:pStyle w:val="Heading3"/>
-        <w:spacing w:before="160" w:after="80"/>
-      </w:pPr>
-      <w:r>
-        <w:rPr>
-          <w:rFonts w:ascii="Calibri" w:eastAsia="Calibri" w:hAnsi="Calibri" w:cs="Calibri"/>
-          <w:b/>
-          <w:bCs/>
-          <w:color w:val="475569"/>
-          <w:sz w:val="21"/>
-          <w:szCs w:val="21"/>
-        </w:rPr>
-        <w:t>7. Connect physical sensors</w:t>
+        <w:t xml:space="preserve">Click a seat in the car maps to toggle it between empty and occupied.</w:t>
       </w:r>
     </w:p>
     <w:p>
@@ -13976,7 +14388,7 @@
           <w:sz w:val="19"/>
           <w:szCs w:val="19"/>
         </w:rPr>
-        <w:t>Ask the hardware operator to confirm the current firmware, safe wiring and mounting. Sensor index 0/GPIO34 maps to A1; index 1/GPIO35 maps to B1.</w:t>
+        <w:t xml:space="preserve">Next stop: over about 2.4 seconds simulated passengers leave, then others board, at random. The station advances, which clears all phone assignments. Physical seats never change.</w:t>
       </w:r>
     </w:p>
     <w:p>
@@ -13995,7 +14407,38 @@
           <w:sz w:val="19"/>
           <w:szCs w:val="19"/>
         </w:rPr>
-        <w:t>Close Arduino Serial Monitor/Plotter, the console seat programs and any other process using the port. Only one reader can own it.</w:t>
+        <w:t xml:space="preserve">Automatic stops (5, 10, 15 or 30 s) are advanced by page polling, so keep Controls or the platform screen open. A running stop may finish after Stop auto stops.</w:t>
+      </w:r>
+    </w:p>
+    <w:p>
+      <w:pPr>
+        <w:spacing w:after="110" w:line="264" w:lineRule="auto"/>
+      </w:pPr>
+      <w:r>
+        <w:rPr>
+          <w:rFonts w:ascii="Calibri" w:eastAsia="Calibri" w:hAnsi="Calibri" w:cs="Calibri"/>
+          <w:color w:val="0F172A"/>
+          <w:sz w:val="19"/>
+          <w:szCs w:val="19"/>
+        </w:rPr>
+        <w:t xml:space="preserve">Example free counts: A12, B3, C0, D25, E48, F7, G36, H18, I1, J60, K29, L72; total 311 (24%), so the screen shows counts. At 259 or fewer (under 20%) it shows “Space here”. Stops are synthetic activity, not a passenger-flow model.</w:t>
+      </w:r>
+    </w:p>
+    <w:p>
+      <w:pPr>
+        <w:pStyle w:val="Heading3"/>
+        <w:spacing w:before="160" w:after="80"/>
+      </w:pPr>
+      <w:r>
+        <w:rPr>
+          <w:rFonts w:ascii="Calibri" w:eastAsia="Calibri" w:hAnsi="Calibri" w:cs="Calibri"/>
+          <w:b/>
+          <w:bCs/>
+          <w:color w:val="475569"/>
+          <w:sz w:val="21"/>
+          <w:szCs w:val="21"/>
+        </w:rPr>
+        <w:t xml:space="preserve">8. Connect physical sensors</w:t>
       </w:r>
     </w:p>
     <w:p>
@@ -14014,7 +14457,7 @@
           <w:sz w:val="19"/>
           <w:szCs w:val="19"/>
         </w:rPr>
-        <w:t>In Controls, choose Refresh ports, select or type the actual port, and click Connect hardware · hybrid mode.</w:t>
+        <w:t xml:space="preserve">Confirm firmware, wiring and mounting with the hardware operator. Sensor 0/GPIO34 is A1; sensor 1/GPIO35 is B1.</w:t>
       </w:r>
     </w:p>
     <w:p>
@@ -14033,7 +14476,7 @@
           <w:sz w:val="19"/>
           <w:szCs w:val="19"/>
         </w:rPr>
-        <w:t>Leave both physical seats empty through calibration. Connecting may reset the ESP32. About five seconds is typical, not a guarantee; wait for completion and fresh sensor states.</w:t>
+        <w:t xml:space="preserve">Close Arduino Serial Monitor/Plotter and any other program using the port; only one reader can own it.</w:t>
       </w:r>
     </w:p>
     <w:p>
@@ -14052,7 +14495,7 @@
           <w:sz w:val="19"/>
           <w:szCs w:val="19"/>
         </w:rPr>
-        <w:t>A1/B1 show sensor sources and cannot be clicked. All other 1,294 seats remain editable.</w:t>
+        <w:t xml:space="preserve">In Controls, choose Refresh ports, select the actual port and click Connect hardware · hybrid mode.</w:t>
       </w:r>
     </w:p>
     <w:p>
@@ -14071,66 +14514,7 @@
           <w:sz w:val="19"/>
           <w:szCs w:val="19"/>
         </w:rPr>
-        <w:t>Place a target within the validated detection range; after firmware confirmation the corresponding seat/count updates. Remove it to restore empty.</w:t>
-      </w:r>
-    </w:p>
-    <w:p>
-      <w:pPr>
-        <w:spacing w:after="110" w:line="264" w:lineRule="auto"/>
-      </w:pPr>
-      <w:r>
-        <w:rPr>
-          <w:rFonts w:ascii="Calibri" w:eastAsia="Calibri" w:hAnsi="Calibri" w:cs="Calibri"/>
-          <w:color w:val="0F172A"/>
-          <w:sz w:val="19"/>
-          <w:szCs w:val="19"/>
-        </w:rPr>
-        <w:t>For a clear audience demonstration, stop auto, connect hybrid with both real seats empty, then choose Occupy simulated seats. A and B should each show one free seat. Covering one sensor changes its car to zero/red; the other car should not change. See the complete demo script (DEMO_SCRIPT.md).</w:t>
-      </w:r>
-    </w:p>
-    <w:p>
-      <w:pPr>
-        <w:spacing w:after="110" w:line="264" w:lineRule="auto"/>
-      </w:pPr>
-      <w:r>
-        <w:rPr>
-          <w:rFonts w:ascii="Calibri" w:eastAsia="Calibri" w:hAnsi="Calibri" w:cs="Calibri"/>
-          <w:color w:val="0F172A"/>
-          <w:sz w:val="19"/>
-          <w:szCs w:val="19"/>
-        </w:rPr>
-        <w:t>If the ESP32 disconnects, A1/B1 become unknown; simulated values do not silently replace them. The worker retries the same COM port. If the OS assigns a different name, select it and reconnect. Reconnection/reset may recalibrate, so keep physical seats empty again.</w:t>
-      </w:r>
-    </w:p>
-    <w:p>
-      <w:pPr>
-        <w:spacing w:after="110" w:line="264" w:lineRule="auto"/>
-      </w:pPr>
-      <w:r>
-        <w:rPr>
-          <w:rFonts w:ascii="Calibri" w:eastAsia="Calibri" w:hAnsi="Calibri" w:cs="Calibri"/>
-          <w:color w:val="0F172A"/>
-          <w:sz w:val="19"/>
-          <w:szCs w:val="19"/>
-        </w:rPr>
-        <w:t>Use Hardware diagnostics &amp; mapping to view last distance, noise, state age, pending change, connection detail and latest board message. This message is not a saved log. Persistent WARN messages need investigation; they are not automatically cleared by ordinary status updates.</w:t>
-      </w:r>
-    </w:p>
-    <w:p>
-      <w:pPr>
-        <w:pStyle w:val="Heading3"/>
-        <w:spacing w:before="160" w:after="80"/>
-      </w:pPr>
-      <w:r>
-        <w:rPr>
-          <w:rFonts w:ascii="Calibri" w:eastAsia="Calibri" w:hAnsi="Calibri" w:cs="Calibri"/>
-          <w:b/>
-          <w:bCs/>
-          <w:color w:val="475569"/>
-          <w:sz w:val="21"/>
-          <w:szCs w:val="21"/>
-        </w:rPr>
-        <w:t>8. Phone or second-laptop passenger display (optional)</w:t>
+        <w:t xml:space="preserve">Keep both seats empty through calibration (typically about five seconds; connecting may reset the ESP32). A1/B1 then show sensor sources and cannot be clicked.</w:t>
       </w:r>
     </w:p>
     <w:p>
@@ -14149,17 +14533,12 @@
           <w:sz w:val="19"/>
           <w:szCs w:val="19"/>
         </w:rPr>
-        <w:t>Stop the existing local server before starting another on the same port.</w:t>
-      </w:r>
-    </w:p>
-    <w:p>
-      <w:pPr>
-        <w:pStyle w:val="ListParagraph"/>
-        <w:numPr>
-          <w:ilvl w:val="0"/>
-          <w:numId w:val="2"/>
-        </w:numPr>
-        <w:spacing w:after="60" w:line="264" w:lineRule="auto"/>
+        <w:t xml:space="preserve">A target in the validated range occupies the seat after firmware confirmation; removing it restores empty.</w:t>
+      </w:r>
+    </w:p>
+    <w:p>
+      <w:pPr>
+        <w:spacing w:after="110" w:line="264" w:lineRule="auto"/>
       </w:pPr>
       <w:r>
         <w:rPr>
@@ -14168,17 +14547,12 @@
           <w:sz w:val="19"/>
           <w:szCs w:val="19"/>
         </w:rPr>
-        <w:t>Put the devices on a trusted private network or hotspot.</w:t>
-      </w:r>
-    </w:p>
-    <w:p>
-      <w:pPr>
-        <w:pStyle w:val="ListParagraph"/>
-        <w:numPr>
-          <w:ilvl w:val="0"/>
-          <w:numId w:val="2"/>
-        </w:numPr>
-        <w:spacing w:after="60" w:line="264" w:lineRule="auto"/>
+        <w:t xml:space="preserve">Demonstration: stop auto, connect with both real seats empty, then choose Occupy simulated seats. Controls shows one free seat in A and in B; the platform screen marks both “Space here” because the train is under 20% free. Covering one sensor turns its carriage to “No free seats”.</w:t>
+      </w:r>
+    </w:p>
+    <w:p>
+      <w:pPr>
+        <w:spacing w:after="110" w:line="264" w:lineRule="auto"/>
       </w:pPr>
       <w:r>
         <w:rPr>
@@ -14187,74 +14561,7 @@
           <w:sz w:val="19"/>
           <w:szCs w:val="19"/>
         </w:rPr>
-        <w:t>Double-click start_dashboard_network.bat (../start_dashboard_network.bat), or start with --host 0.0.0.0.</w:t>
-      </w:r>
-    </w:p>
-    <w:p>
-      <w:pPr>
-        <w:pStyle w:val="ListParagraph"/>
-        <w:numPr>
-          <w:ilvl w:val="0"/>
-          <w:numId w:val="2"/>
-        </w:numPr>
-        <w:spacing w:after="60" w:line="264" w:lineRule="auto"/>
-      </w:pPr>
-      <w:r>
-        <w:rPr>
-          <w:rFonts w:ascii="Calibri" w:eastAsia="Calibri" w:hAnsi="Calibri" w:cs="Calibri"/>
-          <w:color w:val="0F172A"/>
-          <w:sz w:val="19"/>
-          <w:szCs w:val="19"/>
-        </w:rPr>
-        <w:t>Read the On this network URL printed in the console; open that exact LAN address on the phone. 127.0.0.1 on the phone refers to the phone, not the laptop.</w:t>
-      </w:r>
-    </w:p>
-    <w:p>
-      <w:pPr>
-        <w:pStyle w:val="ListParagraph"/>
-        <w:numPr>
-          <w:ilvl w:val="0"/>
-          <w:numId w:val="2"/>
-        </w:numPr>
-        <w:spacing w:after="60" w:line="264" w:lineRule="auto"/>
-      </w:pPr>
-      <w:r>
-        <w:rPr>
-          <w:rFonts w:ascii="Calibri" w:eastAsia="Calibri" w:hAnsi="Calibri" w:cs="Calibri"/>
-          <w:color w:val="0F172A"/>
-          <w:sz w:val="19"/>
-          <w:szCs w:val="19"/>
-        </w:rPr>
-        <w:t>If Windows asks, allow the application only on the appropriate private network. Do not disable the firewall globally.</w:t>
-      </w:r>
-    </w:p>
-    <w:p>
-      <w:pPr>
-        <w:spacing w:after="110" w:line="264" w:lineRule="auto"/>
-      </w:pPr>
-      <w:r>
-        <w:rPr>
-          <w:rFonts w:ascii="Calibri" w:eastAsia="Calibri" w:hAnsi="Calibri" w:cs="Calibri"/>
-          <w:color w:val="0F172A"/>
-          <w:sz w:val="19"/>
-          <w:szCs w:val="19"/>
-        </w:rPr>
-        <w:t>The phone is read-only: the controls page, serial-port list and mutation requests are refused for remote clients. Use localhost on the host laptop for controls. Network viewing has no password; anyone able to access the service on that network can view data. Do not expose it to the internet, add a public tunnel or treat it as production security.</w:t>
-      </w:r>
-    </w:p>
-    <w:p>
-      <w:pPr>
-        <w:spacing w:after="110" w:line="264" w:lineRule="auto"/>
-      </w:pPr>
-      <w:r>
-        <w:rPr>
-          <w:rFonts w:ascii="Calibri" w:eastAsia="Calibri" w:hAnsi="Calibri" w:cs="Calibri"/>
-          <w:color w:val="0F172A"/>
-          <w:sz w:val="19"/>
-          <w:szCs w:val="19"/>
-        </w:rPr>
-        <w:lastRenderedPageBreak/>
-        <w:t>Campus Wi-Fi may isolate devices. Use a tested hotspot or simply present on the laptop. This network feature does not make the ESP32-to-laptop USB connection wireless.</w:t>
+        <w:t xml:space="preserve">If the ESP32 disconnects, A1/B1 become unknown (“Some seats not reported”) and are never filled with simulated values. The worker retries the same port; if Windows renames it, select it and reconnect with the seats empty. Hardware diagnostics &amp; mapping shows distance, noise, state age and the latest board message.</w:t>
       </w:r>
     </w:p>
     <w:p>
@@ -14271,7 +14578,114 @@
           <w:sz w:val="21"/>
           <w:szCs w:val="21"/>
         </w:rPr>
-        <w:t>9. Common problems</w:t>
+        <w:t xml:space="preserve">9. Phone access over the network (optional)</w:t>
+      </w:r>
+    </w:p>
+    <w:p>
+      <w:pPr>
+        <w:pStyle w:val="ListParagraph"/>
+        <w:numPr>
+          <w:ilvl w:val="0"/>
+          <w:numId w:val="6"/>
+        </w:numPr>
+        <w:spacing w:after="60" w:line="264" w:lineRule="auto"/>
+      </w:pPr>
+      <w:r>
+        <w:rPr>
+          <w:rFonts w:ascii="Calibri" w:eastAsia="Calibri" w:hAnsi="Calibri" w:cs="Calibri"/>
+          <w:color w:val="0F172A"/>
+          <w:sz w:val="19"/>
+          <w:szCs w:val="19"/>
+        </w:rPr>
+        <w:t xml:space="preserve">Put the laptop and phones on a trusted private network or hotspot; campus Wi-Fi may isolate devices.</w:t>
+      </w:r>
+    </w:p>
+    <w:p>
+      <w:pPr>
+        <w:pStyle w:val="ListParagraph"/>
+        <w:numPr>
+          <w:ilvl w:val="0"/>
+          <w:numId w:val="6"/>
+        </w:numPr>
+        <w:spacing w:after="60" w:line="264" w:lineRule="auto"/>
+      </w:pPr>
+      <w:r>
+        <w:rPr>
+          <w:rFonts w:ascii="Calibri" w:eastAsia="Calibri" w:hAnsi="Calibri" w:cs="Calibri"/>
+          <w:color w:val="0F172A"/>
+          <w:sz w:val="19"/>
+          <w:szCs w:val="19"/>
+        </w:rPr>
+        <w:t xml:space="preserve">Add --host 0.0.0.0 to the passenger command in Section 4 (once integrated, use start_dashboard_network.bat instead).</w:t>
+      </w:r>
+    </w:p>
+    <w:p>
+      <w:pPr>
+        <w:pStyle w:val="ListParagraph"/>
+        <w:numPr>
+          <w:ilvl w:val="0"/>
+          <w:numId w:val="6"/>
+        </w:numPr>
+        <w:spacing w:after="60" w:line="264" w:lineRule="auto"/>
+      </w:pPr>
+      <w:r>
+        <w:rPr>
+          <w:rFonts w:ascii="Calibri" w:eastAsia="Calibri" w:hAnsi="Calibri" w:cs="Calibri"/>
+          <w:color w:val="0F172A"/>
+          <w:sz w:val="19"/>
+          <w:szCs w:val="19"/>
+        </w:rPr>
+        <w:t xml:space="preserve">On the phone, open http://&lt;laptop IPv4 address&gt;:8766/app (8765 once integrated); ipconfig shows the address. 127.0.0.1 on a phone is the phone itself.</w:t>
+      </w:r>
+    </w:p>
+    <w:p>
+      <w:pPr>
+        <w:pStyle w:val="ListParagraph"/>
+        <w:numPr>
+          <w:ilvl w:val="0"/>
+          <w:numId w:val="6"/>
+        </w:numPr>
+        <w:spacing w:after="60" w:line="264" w:lineRule="auto"/>
+      </w:pPr>
+      <w:r>
+        <w:rPr>
+          <w:rFonts w:ascii="Calibri" w:eastAsia="Calibri" w:hAnsi="Calibri" w:cs="Calibri"/>
+          <w:color w:val="0F172A"/>
+          <w:sz w:val="19"/>
+          <w:szCs w:val="19"/>
+        </w:rPr>
+        <w:t xml:space="preserve">If Windows asks, allow the program on private networks only; do not disable the firewall.</w:t>
+      </w:r>
+    </w:p>
+    <w:p>
+      <w:pPr>
+        <w:spacing w:after="110" w:line="264" w:lineRule="auto"/>
+      </w:pPr>
+      <w:r>
+        <w:rPr>
+          <w:rFonts w:ascii="Calibri" w:eastAsia="Calibri" w:hAnsi="Calibri" w:cs="Calibri"/>
+          <w:color w:val="0F172A"/>
+          <w:sz w:val="19"/>
+          <w:szCs w:val="19"/>
+        </w:rPr>
+        <w:t xml:space="preserve">Phones can only request and hand back assignments, never change seats, modes or ports. There is no password: do not expose the service to the internet or a public tunnel.</w:t>
+      </w:r>
+    </w:p>
+    <w:p>
+      <w:pPr>
+        <w:pStyle w:val="Heading3"/>
+        <w:spacing w:before="160" w:after="80"/>
+      </w:pPr>
+      <w:r>
+        <w:rPr>
+          <w:rFonts w:ascii="Calibri" w:eastAsia="Calibri" w:hAnsi="Calibri" w:cs="Calibri"/>
+          <w:b/>
+          <w:bCs/>
+          <w:color w:val="475569"/>
+          <w:sz w:val="21"/>
+          <w:szCs w:val="21"/>
+        </w:rPr>
+        <w:t xml:space="preserve">10. Common problems</w:t>
       </w:r>
     </w:p>
     <w:tbl>
@@ -14292,8 +14706,8 @@
         <w:tblLook w:val="0000" w:firstRow="0" w:lastRow="0" w:firstColumn="0" w:lastColumn="0" w:noHBand="0" w:noVBand="0"/>
       </w:tblPr>
       <w:tblGrid>
-        <w:gridCol w:w="4649"/>
-        <w:gridCol w:w="4651"/>
+        <w:gridCol w:w="4650"/>
+        <w:gridCol w:w="4650"/>
       </w:tblGrid>
       <w:tr>
         <w:tblPrEx>
@@ -14329,7 +14743,7 @@
                 <w:sz w:val="18"/>
                 <w:szCs w:val="18"/>
               </w:rPr>
-              <w:t>Symptom</w:t>
+              <w:t xml:space="preserve">Symptom</w:t>
             </w:r>
           </w:p>
         </w:tc>
@@ -14357,7 +14771,7 @@
                 <w:sz w:val="18"/>
                 <w:szCs w:val="18"/>
               </w:rPr>
-              <w:t>Action</w:t>
+              <w:t xml:space="preserve">Action</w:t>
             </w:r>
           </w:p>
         </w:tc>
@@ -14390,7 +14804,7 @@
                 <w:sz w:val="18"/>
                 <w:szCs w:val="18"/>
               </w:rPr>
-              <w:t>Missing Flask, serial or Waitress</w:t>
+              <w:t xml:space="preserve">Missing Flask, serial or Waitress</w:t>
             </w:r>
           </w:p>
         </w:tc>
@@ -14415,7 +14829,7 @@
                 <w:sz w:val="18"/>
                 <w:szCs w:val="18"/>
               </w:rPr>
-              <w:t>Install requirements using the same interpreter that launches the server</w:t>
+              <w:t xml:space="preserve">Install requirements with the interpreter that launches the server</w:t>
             </w:r>
           </w:p>
         </w:tc>
@@ -14448,7 +14862,7 @@
                 <w:sz w:val="18"/>
                 <w:szCs w:val="18"/>
               </w:rPr>
-              <w:t>Page unavailable</w:t>
+              <w:t xml:space="preserve">Page unavailable</w:t>
             </w:r>
           </w:p>
         </w:tc>
@@ -14473,7 +14887,7 @@
                 <w:sz w:val="18"/>
                 <w:szCs w:val="18"/>
               </w:rPr>
-              <w:t>Check the server terminal, URL and HTTP port; keep terminal open</w:t>
+              <w:t xml:space="preserve">Check the console, address and port</w:t>
             </w:r>
           </w:p>
         </w:tc>
@@ -14506,7 +14920,7 @@
                 <w:sz w:val="18"/>
                 <w:szCs w:val="18"/>
               </w:rPr>
-              <w:t>Port already in use</w:t>
+              <w:t xml:space="preserve">Port already in use</w:t>
             </w:r>
           </w:p>
         </w:tc>
@@ -14531,7 +14945,7 @@
                 <w:sz w:val="18"/>
                 <w:szCs w:val="18"/>
               </w:rPr>
-              <w:t>Stop the old server or choose another HTTP port</w:t>
+              <w:t xml:space="preserve">Stop the old server or choose another --http-port</w:t>
             </w:r>
           </w:p>
         </w:tc>
@@ -14564,7 +14978,7 @@
                 <w:sz w:val="18"/>
                 <w:szCs w:val="18"/>
               </w:rPr>
-              <w:t>No COM device</w:t>
+              <w:t xml:space="preserve">Screen ignores Controls or sensors</w:t>
             </w:r>
           </w:p>
         </w:tc>
@@ -14589,7 +15003,7 @@
                 <w:sz w:val="18"/>
                 <w:szCs w:val="18"/>
               </w:rPr>
-              <w:t>Check USB data cable, driver and actual Arduino port</w:t>
+              <w:t xml:space="preserve">Expected from the standalone passenger server; register its routes (Section 4)</w:t>
             </w:r>
           </w:p>
         </w:tc>
@@ -14622,7 +15036,7 @@
                 <w:sz w:val="18"/>
                 <w:szCs w:val="18"/>
               </w:rPr>
-              <w:t>COM access denied</w:t>
+              <w:t xml:space="preserve">Phone cannot load or shows an error</w:t>
             </w:r>
           </w:p>
         </w:tc>
@@ -14647,7 +15061,7 @@
                 <w:sz w:val="18"/>
                 <w:szCs w:val="18"/>
               </w:rPr>
-              <w:t>Close every other serial reader, then retry</w:t>
+              <w:t xml:space="preserve">Check network, address, port, firewall and client isolation; once integrated, confirm the guard change in PASSENGER_INTERFACES.md</w:t>
             </w:r>
           </w:p>
         </w:tc>
@@ -14680,7 +15094,7 @@
                 <w:sz w:val="18"/>
                 <w:szCs w:val="18"/>
               </w:rPr>
-              <w:t>A1/B1 gray after connecting</w:t>
+              <w:t xml:space="preserve">No COM device</w:t>
             </w:r>
           </w:p>
         </w:tc>
@@ -14705,7 +15119,7 @@
                 <w:sz w:val="18"/>
                 <w:szCs w:val="18"/>
               </w:rPr>
-              <w:t>Wait for calibration; inspect messages; verify correct firmware, 115200 baud and two sensor entries</w:t>
+              <w:t xml:space="preserve">Check USB data cable, driver and actual port</w:t>
             </w:r>
           </w:p>
         </w:tc>
@@ -14738,7 +15152,7 @@
                 <w:sz w:val="18"/>
                 <w:szCs w:val="18"/>
               </w:rPr>
-              <w:t>Wrong physical seat changes</w:t>
+              <w:t xml:space="preserve">COM access denied</w:t>
             </w:r>
           </w:p>
         </w:tc>
@@ -14763,7 +15177,7 @@
                 <w:sz w:val="18"/>
                 <w:szCs w:val="18"/>
               </w:rPr>
-              <w:t>Verify sensor index/GPIO mapping with the operator, rather than guessing</w:t>
+              <w:t xml:space="preserve">Close every other serial reader, then retry</w:t>
             </w:r>
           </w:p>
         </w:tc>
@@ -14796,7 +15210,7 @@
                 <w:sz w:val="18"/>
                 <w:szCs w:val="18"/>
               </w:rPr>
-              <w:t>False readings</w:t>
+              <w:t xml:space="preserve">A1/B1 not reported after connecting</w:t>
             </w:r>
           </w:p>
         </w:tc>
@@ -14821,7 +15235,7 @@
                 <w:sz w:val="18"/>
                 <w:szCs w:val="18"/>
               </w:rPr>
-              <w:t>Check range, mounting, noise, supply, capacitors and lighting before changing thresholds</w:t>
+              <w:t xml:space="preserve">Wait for calibration; verify firmware, 115200 baud and two sensor entries</w:t>
             </w:r>
           </w:p>
         </w:tc>
@@ -14854,7 +15268,7 @@
                 <w:sz w:val="18"/>
                 <w:szCs w:val="18"/>
               </w:rPr>
-              <w:t>Preset changes again by itself</w:t>
+              <w:t xml:space="preserve">Wrong physical seat changes</w:t>
             </w:r>
           </w:p>
         </w:tc>
@@ -14879,7 +15293,7 @@
                 <w:sz w:val="18"/>
                 <w:szCs w:val="18"/>
               </w:rPr>
-              <w:t>Stop automatic stops before reapplying the preset</w:t>
+              <w:t xml:space="preserve">Verify sensor index/GPIO mapping with the operator</w:t>
             </w:r>
           </w:p>
         </w:tc>
@@ -14912,7 +15326,7 @@
                 <w:sz w:val="18"/>
                 <w:szCs w:val="18"/>
               </w:rPr>
-              <w:t>Phone cannot load</w:t>
+              <w:t xml:space="preserve">False readings</w:t>
             </w:r>
           </w:p>
         </w:tc>
@@ -14937,7 +15351,7 @@
                 <w:sz w:val="18"/>
                 <w:szCs w:val="18"/>
               </w:rPr>
-              <w:t>Check private network, printed LAN URL, firewall and client isolation; fall back to laptop</w:t>
+              <w:t xml:space="preserve">Check range, mounting, noise, supply and capacitors before changing thresholds</w:t>
             </w:r>
           </w:p>
         </w:tc>
@@ -14970,7 +15384,7 @@
                 <w:sz w:val="18"/>
                 <w:szCs w:val="18"/>
               </w:rPr>
-              <w:t>“Full” seems misleading</w:t>
+              <w:t xml:space="preserve">Preset changes by itself</w:t>
             </w:r>
           </w:p>
         </w:tc>
@@ -14995,7 +15409,7 @@
                 <w:sz w:val="18"/>
                 <w:szCs w:val="18"/>
               </w:rPr>
-              <w:t>It means no free seats, not standing capacity or a boarding restriction</w:t>
+              <w:t xml:space="preserve">Stop automatic stops first</w:t>
             </w:r>
           </w:p>
         </w:tc>
@@ -15020,7 +15434,7 @@
           <w:sz w:val="21"/>
           <w:szCs w:val="21"/>
         </w:rPr>
-        <w:t>10. Evidence and limits</w:t>
+        <w:t xml:space="preserve">11. Evidence and limits</w:t>
       </w:r>
     </w:p>
     <w:p>
@@ -15034,21 +15448,7 @@
           <w:sz w:val="19"/>
           <w:szCs w:val="19"/>
         </w:rPr>
-        <w:t>Capture current screenshots, a real hardware video and completed test results (TEST_RESULTS_TEMPLATE.md). Raw serial recording can be done with the existing console program in a separate run after releasing the dashboard's port. Do not call that a simultaneous dashboard capture.</w:t>
-      </w:r>
-    </w:p>
-    <w:p>
-      <w:pPr>
-        <w:spacing w:after="110" w:line="264" w:lineRule="auto"/>
-      </w:pPr>
-      <w:r>
-        <w:rPr>
-          <w:rFonts w:ascii="Calibri" w:eastAsia="Calibri" w:hAnsi="Calibri" w:cs="Calibri"/>
-          <w:color w:val="0F172A"/>
-          <w:sz w:val="19"/>
-          <w:szCs w:val="19"/>
-        </w:rPr>
-        <w:t>No persistent database, saved dashboard session, reservation system, live train arrival feed or measured dwell-time optimization is included. Source-based descriptions in this manual must not be relabeled as physical test results.</w:t>
+        <w:t xml:space="preserve">Capture screenshots of both interfaces, a hardware video and completed test results (TEST_RESULTS_TEMPLATE.md). There is no database, reservation, live train feed or measured dwell-time optimization; assignments live in server memory and the phone keeps only a random ticket. Source-based descriptions must not be relabeled as physical test results.</w:t>
       </w:r>
     </w:p>
     <w:p>
@@ -15927,6 +16327,18 @@
   </w:num>
   <w:num w:numId="4" w16cid:durableId="774908723">
     <w:abstractNumId w:val="4"/>
+    <w:lvlOverride w:ilvl="0">
+      <w:startOverride w:val="1"/>
+    </w:lvlOverride>
+  </w:num>
+  <w:num w:numId="5">
+    <w:abstractNumId w:val="0"/>
+    <w:lvlOverride w:ilvl="0">
+      <w:startOverride w:val="1"/>
+    </w:lvlOverride>
+  </w:num>
+  <w:num w:numId="6">
+    <w:abstractNumId w:val="0"/>
     <w:lvlOverride w:ilvl="0">
       <w:startOverride w:val="1"/>
     </w:lvlOverride>
@@ -16424,6 +16836,7 @@
   <w:style w:type="character" w:default="1" w:styleId="DefaultParagraphFont">
     <w:name w:val="Default Paragraph Font"/>
     <w:uiPriority w:val="1"/>
+    <w:semiHidden/>
     <w:unhideWhenUsed/>
   </w:style>
   <w:style w:type="table" w:default="1" w:styleId="TableNormal">

</xml_diff>